<commit_message>
v1.0.1: re-measure rows 1-4 against coverage-matched controls; row 4 changed sign; row 7 reframed as a bound
</commit_message>
<xml_diff>
--- a/paper/mcp-supply-chain-nulls.docx
+++ b/paper/mcp-supply-chain-nulls.docx
@@ -14,7 +14,7 @@
           <w:sz w:val="34"/>
           <w:szCs w:val="34"/>
         </w:rPr>
-        <w:t xml:space="preserve">Measuring the MCP Supply Chain: Eight Null Results and a Population That Is Not the Population</w:t>
+        <w:t xml:space="preserve">Measuring the MCP Supply Chain: No Elevated Risk on the Dimensions a Registry Exposes, and a Population That Is Not the Population</w:t>
       </w:r>
     </w:p>
     <w:p>
@@ -74,7 +74,7 @@
           <w:sz w:val="21"/>
           <w:szCs w:val="21"/>
         </w:rPr>
-        <w:t xml:space="preserve">Version 1.0, 7 September 2026</w:t>
+        <w:t xml:space="preserve">Version 1.0.1, 7 September 2026</w:t>
       </w:r>
     </w:p>
     <w:p>
@@ -150,15 +150,15 @@
           <w:sz w:val="21"/>
           <w:szCs w:val="21"/>
         </w:rPr>
-        <w:t xml:space="preserve">Seven came back null.</w:t>
-      </w:r>
-      <w:r>
-        <w:rPr>
-          <w:rFonts w:ascii="Georgia" w:cs="Georgia" w:eastAsia="Georgia" w:hAnsi="Georgia"/>
-          <w:sz w:val="21"/>
-          <w:szCs w:val="21"/>
-        </w:rPr>
-        <w:t xml:space="preserve"> On every dimension a package registry can expose, MCP servers on npm are statistically indistinguishable from comparable npm packages, and on two dimensions they are measurably better.</w:t>
+        <w:t xml:space="preserve">No dimension shows elevated risk.</w:t>
+      </w:r>
+      <w:r>
+        <w:rPr>
+          <w:rFonts w:ascii="Georgia" w:cs="Georgia" w:eastAsia="Georgia" w:hAnsi="Georgia"/>
+          <w:sz w:val="21"/>
+          <w:szCs w:val="21"/>
+        </w:rPr>
+        <w:t xml:space="preserve"> Against controls matched on sampling coverage, MCP servers on npm are indistinguishable from comparable packages on install-script execution and single-version publication, are lower on license-file absence, and are no worse on deprecated dependencies, where they are level with one control and lower than the other. They publish more often than the controls, not less. On name collision they are lower than one control and higher than the other, and the control they lose to is the one drawn from a comparably sized population. The residual coverage mismatch between our frames runs in MCP's favour on the licensing dimensions, so we report those as not worse rather than as better.</w:t>
       </w:r>
     </w:p>
     <w:p>
@@ -172,7 +172,7 @@
           <w:sz w:val="21"/>
           <w:szCs w:val="21"/>
         </w:rPr>
-        <w:t xml:space="preserve">The eighth appeared to be a real finding and then dissolved under usage weighting. Python-distributed MCP servers are 2.4 times more likely than age-matched PyPI packages to ship with no license information at all, at 32.8% against a baseline near 18%. Weighted by actual installs, that rate falls to </w:t>
+        <w:t xml:space="preserve">The eighth appeared to be a real finding and then dissolved under usage weighting. Python-distributed MCP servers ship with no license information at all at 32.8% against a PyPI baseline of 18.0%, a risk ratio of 1.8 and an age-adjusted odds ratio of 2.45. Weighted by actual installs, that rate falls to </w:t>
       </w:r>
       <w:r>
         <w:rPr>
@@ -240,7 +240,7 @@
           <w:sz w:val="21"/>
           <w:szCs w:val="21"/>
         </w:rPr>
-        <w:t xml:space="preserve"> of all installs in our sample. The published population and the installed population are almost disjoint. Any study that samples packages uniformly, as every study of this kind including our own first seven rounds does, is describing software that essentially nobody runs. Docker's curated catalog, measured the same way, has a Gini of 0.71 and a top item at 11.4%, which suggests the tail is a property of open publication rather than of MCP.</w:t>
+        <w:t xml:space="preserve"> of all installs in our sample. The published population and the installed population are almost disjoint. Any study that samples packages uniformly, as every study of this kind including our own first six rounds did, is describing software that essentially nobody runs. Docker's curated catalog, measured the same way, has a Gini of 0.71 and a top item at 11.4%, which suggests the tail is a property of open publication rather than of MCP.</w:t>
       </w:r>
     </w:p>
     <w:p>
@@ -621,7 +621,7 @@
           <w:sz w:val="21"/>
           <w:szCs w:val="21"/>
         </w:rPr>
-        <w:t xml:space="preserve"> (mean 88.6, p90 165, maximum 589) at depth up to 10. A quarter install exactly one. Two thirds install more than 50.</w:t>
+        <w:t xml:space="preserve"> (mean 88.6, p90 165, maximum 589) at depth up to 11. A quarter install exactly one. Two thirds install more than 50.</w:t>
       </w:r>
     </w:p>
     <w:p>
@@ -709,7 +709,7 @@
           <w:sz w:val="21"/>
           <w:szCs w:val="21"/>
         </w:rPr>
-        <w:t xml:space="preserve"> The registry search API reports 8,229 packages carrying the keyword </w:t>
+        <w:t xml:space="preserve"> The registry search API reports 8,227 packages carrying the keyword </w:t>
       </w:r>
       <w:r>
         <w:rPr>
@@ -973,7 +973,7 @@
                 <w:sz w:val="21"/>
                 <w:szCs w:val="21"/>
               </w:rPr>
-              <w:t xml:space="preserve">8,229</w:t>
+              <w:t xml:space="preserve">8,227</w:t>
             </w:r>
           </w:p>
         </w:tc>
@@ -1387,7 +1387,7 @@
           <w:sz w:val="21"/>
           <w:szCs w:val="21"/>
         </w:rPr>
-        <w:t xml:space="preserve">Proportions carry 95% normal-approximation intervals; comparisons use a two-proportion z test. Where an outcome scales mechanically with dependency-tree size or package age, we report Mantel-Haenszel odds ratios stratified on that confounder and restrict both arms to a common range.</w:t>
+        <w:t xml:space="preserve">Medians of even-sized samples are reported as the upper of the two central order statistics, so a sample whose exact median is 96.5 is reported as 97. Proportions carry 95% normal-approximation intervals; comparisons use a two-proportion z test. Where an outcome scales mechanically with dependency-tree size or package age, we report Mantel-Haenszel odds ratios stratified on that confounder and restrict both arms to a common range.</w:t>
       </w:r>
     </w:p>
     <w:p>
@@ -2701,7 +2701,53 @@
           <w:sz w:val="26"/>
           <w:szCs w:val="26"/>
         </w:rPr>
-        <w:t xml:space="preserve">4. Result: seven nulls</w:t>
+        <w:t xml:space="preserve">4. Result: no dimension of elevated risk</w:t>
+      </w:r>
+    </w:p>
+    <w:p>
+      <w:pPr>
+        <w:spacing w:after="160"/>
+        <w:jc w:val="left"/>
+      </w:pPr>
+      <w:r>
+        <w:rPr>
+          <w:rFonts w:ascii="Georgia" w:cs="Georgia" w:eastAsia="Georgia" w:hAnsi="Georgia"/>
+          <w:sz w:val="21"/>
+          <w:szCs w:val="21"/>
+        </w:rPr>
+        <w:t xml:space="preserve">All seven npm dimensions are measured against the two coverage-matched frames described in Section 2.1. Version 1.0.0 of this paper measured rows 1 to 4 against a </w:t>
+      </w:r>
+      <w:r>
+        <w:rPr>
+          <w:rFonts w:ascii="Consolas" w:cs="Consolas" w:eastAsia="Consolas" w:hAnsi="Consolas"/>
+          <w:sz w:val="19"/>
+          <w:szCs w:val="19"/>
+        </w:rPr>
+        <w:t xml:space="preserve">keywords:cli</w:t>
+      </w:r>
+      <w:r>
+        <w:rPr>
+          <w:rFonts w:ascii="Georgia" w:cs="Georgia" w:eastAsia="Georgia" w:hAnsi="Georgia"/>
+          <w:sz w:val="21"/>
+          <w:szCs w:val="21"/>
+        </w:rPr>
+        <w:t xml:space="preserve"> plus </w:t>
+      </w:r>
+      <w:r>
+        <w:rPr>
+          <w:rFonts w:ascii="Consolas" w:cs="Consolas" w:eastAsia="Consolas" w:hAnsi="Consolas"/>
+          <w:sz w:val="19"/>
+          <w:szCs w:val="19"/>
+        </w:rPr>
+        <w:t xml:space="preserve">keywords:server</w:t>
+      </w:r>
+      <w:r>
+        <w:rPr>
+          <w:rFonts w:ascii="Georgia" w:cs="Georgia" w:eastAsia="Georgia" w:hAnsi="Georgia"/>
+          <w:sz w:val="21"/>
+          <w:szCs w:val="21"/>
+        </w:rPr>
+        <w:t xml:space="preserve"> frame instead, which Section 6 shows to be invalid; those four rows have been re-measured and two of them changed direction. Section 11 records what changed.</w:t>
       </w:r>
     </w:p>
     <w:tbl>
@@ -2717,12 +2763,11 @@
         </w:tblBorders>
       </w:tblPr>
       <w:tblGrid>
-        <w:gridCol w:w="1560"/>
-        <w:gridCol w:w="1560"/>
-        <w:gridCol w:w="1560"/>
-        <w:gridCol w:w="1560"/>
-        <w:gridCol w:w="1560"/>
-        <w:gridCol w:w="1560"/>
+        <w:gridCol w:w="1872"/>
+        <w:gridCol w:w="1872"/>
+        <w:gridCol w:w="1872"/>
+        <w:gridCol w:w="1872"/>
+        <w:gridCol w:w="1872"/>
       </w:tblGrid>
       <w:tr>
         <w:trPr>
@@ -2730,7 +2775,7 @@
         </w:trPr>
         <w:tc>
           <w:tcPr>
-            <w:tcW w:type="dxa" w:w="1560"/>
+            <w:tcW w:type="dxa" w:w="1872"/>
             <w:shd w:fill="EFEFEF" w:val="clear"/>
             <w:tcMar>
               <w:top w:type="dxa" w:w="60"/>
@@ -2757,7 +2802,7 @@
         </w:tc>
         <w:tc>
           <w:tcPr>
-            <w:tcW w:type="dxa" w:w="1560"/>
+            <w:tcW w:type="dxa" w:w="1872"/>
             <w:shd w:fill="EFEFEF" w:val="clear"/>
             <w:tcMar>
               <w:top w:type="dxa" w:w="60"/>
@@ -2784,7 +2829,7 @@
         </w:tc>
         <w:tc>
           <w:tcPr>
-            <w:tcW w:type="dxa" w:w="1560"/>
+            <w:tcW w:type="dxa" w:w="1872"/>
             <w:shd w:fill="EFEFEF" w:val="clear"/>
             <w:tcMar>
               <w:top w:type="dxa" w:w="60"/>
@@ -2811,7 +2856,7 @@
         </w:tc>
         <w:tc>
           <w:tcPr>
-            <w:tcW w:type="dxa" w:w="1560"/>
+            <w:tcW w:type="dxa" w:w="1872"/>
             <w:shd w:fill="EFEFEF" w:val="clear"/>
             <w:tcMar>
               <w:top w:type="dxa" w:w="60"/>
@@ -2832,13 +2877,13 @@
                 <w:sz w:val="21"/>
                 <w:szCs w:val="21"/>
               </w:rPr>
-              <w:t xml:space="preserve">Control</w:t>
-            </w:r>
-          </w:p>
-        </w:tc>
-        <w:tc>
-          <w:tcPr>
-            <w:tcW w:type="dxa" w:w="1560"/>
+              <w:t xml:space="preserve">eslint-plugin (74% coverage)</w:t>
+            </w:r>
+          </w:p>
+        </w:tc>
+        <w:tc>
+          <w:tcPr>
+            <w:tcW w:type="dxa" w:w="1872"/>
             <w:shd w:fill="EFEFEF" w:val="clear"/>
             <w:tcMar>
               <w:top w:type="dxa" w:w="60"/>
@@ -2859,34 +2904,7 @@
                 <w:sz w:val="21"/>
                 <w:szCs w:val="21"/>
               </w:rPr>
-              <w:t xml:space="preserve">z</w:t>
-            </w:r>
-          </w:p>
-        </w:tc>
-        <w:tc>
-          <w:tcPr>
-            <w:tcW w:type="dxa" w:w="1560"/>
-            <w:shd w:fill="EFEFEF" w:val="clear"/>
-            <w:tcMar>
-              <w:top w:type="dxa" w:w="60"/>
-              <w:left w:type="dxa" w:w="90"/>
-              <w:bottom w:type="dxa" w:w="60"/>
-              <w:right w:type="dxa" w:w="90"/>
-            </w:tcMar>
-          </w:tcPr>
-          <w:p>
-            <w:pPr>
-              <w:spacing w:after="0"/>
-            </w:pPr>
-            <w:r>
-              <w:rPr>
-                <w:rFonts w:ascii="Georgia" w:cs="Georgia" w:eastAsia="Georgia" w:hAnsi="Georgia"/>
-                <w:b/>
-                <w:bCs/>
-                <w:sz w:val="21"/>
-                <w:szCs w:val="21"/>
-              </w:rPr>
-              <w:t xml:space="preserve">Adjusted OR</w:t>
+              <w:t xml:space="preserve">langchain (100% coverage)</w:t>
             </w:r>
           </w:p>
         </w:tc>
@@ -2897,7 +2915,7 @@
         </w:trPr>
         <w:tc>
           <w:tcPr>
-            <w:tcW w:type="dxa" w:w="1560"/>
+            <w:tcW w:type="dxa" w:w="1872"/>
             <w:tcMar>
               <w:top w:type="dxa" w:w="60"/>
               <w:left w:type="dxa" w:w="90"/>
@@ -2921,7 +2939,7 @@
         </w:tc>
         <w:tc>
           <w:tcPr>
-            <w:tcW w:type="dxa" w:w="1560"/>
+            <w:tcW w:type="dxa" w:w="1872"/>
             <w:tcMar>
               <w:top w:type="dxa" w:w="60"/>
               <w:left w:type="dxa" w:w="90"/>
@@ -2945,7 +2963,7 @@
         </w:tc>
         <w:tc>
           <w:tcPr>
-            <w:tcW w:type="dxa" w:w="1560"/>
+            <w:tcW w:type="dxa" w:w="1872"/>
             <w:tcMar>
               <w:top w:type="dxa" w:w="60"/>
               <w:left w:type="dxa" w:w="90"/>
@@ -2969,73 +2987,49 @@
         </w:tc>
         <w:tc>
           <w:tcPr>
-            <w:tcW w:type="dxa" w:w="1560"/>
-            <w:tcMar>
-              <w:top w:type="dxa" w:w="60"/>
-              <w:left w:type="dxa" w:w="90"/>
-              <w:bottom w:type="dxa" w:w="60"/>
-              <w:right w:type="dxa" w:w="90"/>
-            </w:tcMar>
-          </w:tcPr>
-          <w:p>
-            <w:pPr>
-              <w:spacing w:after="0"/>
-            </w:pPr>
-            <w:r>
-              <w:rPr>
-                <w:rFonts w:ascii="Georgia" w:cs="Georgia" w:eastAsia="Georgia" w:hAnsi="Georgia"/>
-                <w:sz w:val="21"/>
-                <w:szCs w:val="21"/>
-              </w:rPr>
-              <w:t xml:space="preserve">26.0% ±5.4</w:t>
-            </w:r>
-          </w:p>
-        </w:tc>
-        <w:tc>
-          <w:tcPr>
-            <w:tcW w:type="dxa" w:w="1560"/>
-            <w:tcMar>
-              <w:top w:type="dxa" w:w="60"/>
-              <w:left w:type="dxa" w:w="90"/>
-              <w:bottom w:type="dxa" w:w="60"/>
-              <w:right w:type="dxa" w:w="90"/>
-            </w:tcMar>
-          </w:tcPr>
-          <w:p>
-            <w:pPr>
-              <w:spacing w:after="0"/>
-            </w:pPr>
-            <w:r>
-              <w:rPr>
-                <w:rFonts w:ascii="Georgia" w:cs="Georgia" w:eastAsia="Georgia" w:hAnsi="Georgia"/>
-                <w:sz w:val="21"/>
-                <w:szCs w:val="21"/>
-              </w:rPr>
-              <w:t xml:space="preserve">−1.09</w:t>
-            </w:r>
-          </w:p>
-        </w:tc>
-        <w:tc>
-          <w:tcPr>
-            <w:tcW w:type="dxa" w:w="1560"/>
-            <w:tcMar>
-              <w:top w:type="dxa" w:w="60"/>
-              <w:left w:type="dxa" w:w="90"/>
-              <w:bottom w:type="dxa" w:w="60"/>
-              <w:right w:type="dxa" w:w="90"/>
-            </w:tcMar>
-          </w:tcPr>
-          <w:p>
-            <w:pPr>
-              <w:spacing w:after="0"/>
-            </w:pPr>
-            <w:r>
-              <w:rPr>
-                <w:rFonts w:ascii="Georgia" w:cs="Georgia" w:eastAsia="Georgia" w:hAnsi="Georgia"/>
-                <w:sz w:val="21"/>
-                <w:szCs w:val="21"/>
-              </w:rPr>
-              <w:t xml:space="preserve"/>
+            <w:tcW w:type="dxa" w:w="1872"/>
+            <w:tcMar>
+              <w:top w:type="dxa" w:w="60"/>
+              <w:left w:type="dxa" w:w="90"/>
+              <w:bottom w:type="dxa" w:w="60"/>
+              <w:right w:type="dxa" w:w="90"/>
+            </w:tcMar>
+          </w:tcPr>
+          <w:p>
+            <w:pPr>
+              <w:spacing w:after="0"/>
+            </w:pPr>
+            <w:r>
+              <w:rPr>
+                <w:rFonts w:ascii="Georgia" w:cs="Georgia" w:eastAsia="Georgia" w:hAnsi="Georgia"/>
+                <w:sz w:val="21"/>
+                <w:szCs w:val="21"/>
+              </w:rPr>
+              <w:t xml:space="preserve">36.4% ±6.0, z = −3.92</w:t>
+            </w:r>
+          </w:p>
+        </w:tc>
+        <w:tc>
+          <w:tcPr>
+            <w:tcW w:type="dxa" w:w="1872"/>
+            <w:tcMar>
+              <w:top w:type="dxa" w:w="60"/>
+              <w:left w:type="dxa" w:w="90"/>
+              <w:bottom w:type="dxa" w:w="60"/>
+              <w:right w:type="dxa" w:w="90"/>
+            </w:tcMar>
+          </w:tcPr>
+          <w:p>
+            <w:pPr>
+              <w:spacing w:after="0"/>
+            </w:pPr>
+            <w:r>
+              <w:rPr>
+                <w:rFonts w:ascii="Georgia" w:cs="Georgia" w:eastAsia="Georgia" w:hAnsi="Georgia"/>
+                <w:sz w:val="21"/>
+                <w:szCs w:val="21"/>
+              </w:rPr>
+              <w:t xml:space="preserve">50.0% ±6.2, z = −7.32</w:t>
             </w:r>
           </w:p>
         </w:tc>
@@ -3046,7 +3040,7 @@
         </w:trPr>
         <w:tc>
           <w:tcPr>
-            <w:tcW w:type="dxa" w:w="1560"/>
+            <w:tcW w:type="dxa" w:w="1872"/>
             <w:tcMar>
               <w:top w:type="dxa" w:w="60"/>
               <w:left w:type="dxa" w:w="90"/>
@@ -3070,7 +3064,7 @@
         </w:tc>
         <w:tc>
           <w:tcPr>
-            <w:tcW w:type="dxa" w:w="1560"/>
+            <w:tcW w:type="dxa" w:w="1872"/>
             <w:tcMar>
               <w:top w:type="dxa" w:w="60"/>
               <w:left w:type="dxa" w:w="90"/>
@@ -3094,97 +3088,73 @@
         </w:tc>
         <w:tc>
           <w:tcPr>
-            <w:tcW w:type="dxa" w:w="1560"/>
-            <w:tcMar>
-              <w:top w:type="dxa" w:w="60"/>
-              <w:left w:type="dxa" w:w="90"/>
-              <w:bottom w:type="dxa" w:w="60"/>
-              <w:right w:type="dxa" w:w="90"/>
-            </w:tcMar>
-          </w:tcPr>
-          <w:p>
-            <w:pPr>
-              <w:spacing w:after="0"/>
-            </w:pPr>
-            <w:r>
-              <w:rPr>
-                <w:rFonts w:ascii="Georgia" w:cs="Georgia" w:eastAsia="Georgia" w:hAnsi="Georgia"/>
-                <w:sz w:val="21"/>
-                <w:szCs w:val="21"/>
-              </w:rPr>
-              <w:t xml:space="preserve">21.2% ±4.0</w:t>
-            </w:r>
-          </w:p>
-        </w:tc>
-        <w:tc>
-          <w:tcPr>
-            <w:tcW w:type="dxa" w:w="1560"/>
-            <w:tcMar>
-              <w:top w:type="dxa" w:w="60"/>
-              <w:left w:type="dxa" w:w="90"/>
-              <w:bottom w:type="dxa" w:w="60"/>
-              <w:right w:type="dxa" w:w="90"/>
-            </w:tcMar>
-          </w:tcPr>
-          <w:p>
-            <w:pPr>
-              <w:spacing w:after="0"/>
-            </w:pPr>
-            <w:r>
-              <w:rPr>
-                <w:rFonts w:ascii="Georgia" w:cs="Georgia" w:eastAsia="Georgia" w:hAnsi="Georgia"/>
-                <w:sz w:val="21"/>
-                <w:szCs w:val="21"/>
-              </w:rPr>
-              <w:t xml:space="preserve">24.8% ±5.4</w:t>
-            </w:r>
-          </w:p>
-        </w:tc>
-        <w:tc>
-          <w:tcPr>
-            <w:tcW w:type="dxa" w:w="1560"/>
-            <w:tcMar>
-              <w:top w:type="dxa" w:w="60"/>
-              <w:left w:type="dxa" w:w="90"/>
-              <w:bottom w:type="dxa" w:w="60"/>
-              <w:right w:type="dxa" w:w="90"/>
-            </w:tcMar>
-          </w:tcPr>
-          <w:p>
-            <w:pPr>
-              <w:spacing w:after="0"/>
-            </w:pPr>
-            <w:r>
-              <w:rPr>
-                <w:rFonts w:ascii="Georgia" w:cs="Georgia" w:eastAsia="Georgia" w:hAnsi="Georgia"/>
-                <w:sz w:val="21"/>
-                <w:szCs w:val="21"/>
-              </w:rPr>
-              <w:t xml:space="preserve">−1.05</w:t>
-            </w:r>
-          </w:p>
-        </w:tc>
-        <w:tc>
-          <w:tcPr>
-            <w:tcW w:type="dxa" w:w="1560"/>
-            <w:tcMar>
-              <w:top w:type="dxa" w:w="60"/>
-              <w:left w:type="dxa" w:w="90"/>
-              <w:bottom w:type="dxa" w:w="60"/>
-              <w:right w:type="dxa" w:w="90"/>
-            </w:tcMar>
-          </w:tcPr>
-          <w:p>
-            <w:pPr>
-              <w:spacing w:after="0"/>
-            </w:pPr>
-            <w:r>
-              <w:rPr>
-                <w:rFonts w:ascii="Georgia" w:cs="Georgia" w:eastAsia="Georgia" w:hAnsi="Georgia"/>
-                <w:sz w:val="21"/>
-                <w:szCs w:val="21"/>
-              </w:rPr>
-              <w:t xml:space="preserve">0.82</w:t>
+            <w:tcW w:type="dxa" w:w="1872"/>
+            <w:tcMar>
+              <w:top w:type="dxa" w:w="60"/>
+              <w:left w:type="dxa" w:w="90"/>
+              <w:bottom w:type="dxa" w:w="60"/>
+              <w:right w:type="dxa" w:w="90"/>
+            </w:tcMar>
+          </w:tcPr>
+          <w:p>
+            <w:pPr>
+              <w:spacing w:after="0"/>
+            </w:pPr>
+            <w:r>
+              <w:rPr>
+                <w:rFonts w:ascii="Georgia" w:cs="Georgia" w:eastAsia="Georgia" w:hAnsi="Georgia"/>
+                <w:sz w:val="21"/>
+                <w:szCs w:val="21"/>
+              </w:rPr>
+              <w:t xml:space="preserve">21.2% ±4.0 (n=400)</w:t>
+            </w:r>
+          </w:p>
+        </w:tc>
+        <w:tc>
+          <w:tcPr>
+            <w:tcW w:type="dxa" w:w="1872"/>
+            <w:tcMar>
+              <w:top w:type="dxa" w:w="60"/>
+              <w:left w:type="dxa" w:w="90"/>
+              <w:bottom w:type="dxa" w:w="60"/>
+              <w:right w:type="dxa" w:w="90"/>
+            </w:tcMar>
+          </w:tcPr>
+          <w:p>
+            <w:pPr>
+              <w:spacing w:after="0"/>
+            </w:pPr>
+            <w:r>
+              <w:rPr>
+                <w:rFonts w:ascii="Georgia" w:cs="Georgia" w:eastAsia="Georgia" w:hAnsi="Georgia"/>
+                <w:sz w:val="21"/>
+                <w:szCs w:val="21"/>
+              </w:rPr>
+              <w:t xml:space="preserve">36.0% ±6.0, z = −4.12</w:t>
+            </w:r>
+          </w:p>
+        </w:tc>
+        <w:tc>
+          <w:tcPr>
+            <w:tcW w:type="dxa" w:w="1872"/>
+            <w:tcMar>
+              <w:top w:type="dxa" w:w="60"/>
+              <w:left w:type="dxa" w:w="90"/>
+              <w:bottom w:type="dxa" w:w="60"/>
+              <w:right w:type="dxa" w:w="90"/>
+            </w:tcMar>
+          </w:tcPr>
+          <w:p>
+            <w:pPr>
+              <w:spacing w:after="0"/>
+            </w:pPr>
+            <w:r>
+              <w:rPr>
+                <w:rFonts w:ascii="Georgia" w:cs="Georgia" w:eastAsia="Georgia" w:hAnsi="Georgia"/>
+                <w:sz w:val="21"/>
+                <w:szCs w:val="21"/>
+              </w:rPr>
+              <w:t xml:space="preserve">49.2% ±6.2, z = −7.43</w:t>
             </w:r>
           </w:p>
         </w:tc>
@@ -3195,7 +3165,7 @@
         </w:trPr>
         <w:tc>
           <w:tcPr>
-            <w:tcW w:type="dxa" w:w="1560"/>
+            <w:tcW w:type="dxa" w:w="1872"/>
             <w:tcMar>
               <w:top w:type="dxa" w:w="60"/>
               <w:left w:type="dxa" w:w="90"/>
@@ -3219,7 +3189,7 @@
         </w:tc>
         <w:tc>
           <w:tcPr>
-            <w:tcW w:type="dxa" w:w="1560"/>
+            <w:tcW w:type="dxa" w:w="1872"/>
             <w:tcMar>
               <w:top w:type="dxa" w:w="60"/>
               <w:left w:type="dxa" w:w="90"/>
@@ -3243,7 +3213,7 @@
         </w:tc>
         <w:tc>
           <w:tcPr>
-            <w:tcW w:type="dxa" w:w="1560"/>
+            <w:tcW w:type="dxa" w:w="1872"/>
             <w:tcMar>
               <w:top w:type="dxa" w:w="60"/>
               <w:left w:type="dxa" w:w="90"/>
@@ -3267,75 +3237,49 @@
         </w:tc>
         <w:tc>
           <w:tcPr>
-            <w:tcW w:type="dxa" w:w="1560"/>
-            <w:tcMar>
-              <w:top w:type="dxa" w:w="60"/>
-              <w:left w:type="dxa" w:w="90"/>
-              <w:bottom w:type="dxa" w:w="60"/>
-              <w:right w:type="dxa" w:w="90"/>
-            </w:tcMar>
-          </w:tcPr>
-          <w:p>
-            <w:pPr>
-              <w:spacing w:after="0"/>
-            </w:pPr>
-            <w:r>
-              <w:rPr>
-                <w:rFonts w:ascii="Georgia" w:cs="Georgia" w:eastAsia="Georgia" w:hAnsi="Georgia"/>
-                <w:sz w:val="21"/>
-                <w:szCs w:val="21"/>
-              </w:rPr>
-              <w:t xml:space="preserve">22.8% ±5.2</w:t>
-            </w:r>
-          </w:p>
-        </w:tc>
-        <w:tc>
-          <w:tcPr>
-            <w:tcW w:type="dxa" w:w="1560"/>
-            <w:tcMar>
-              <w:top w:type="dxa" w:w="60"/>
-              <w:left w:type="dxa" w:w="90"/>
-              <w:bottom w:type="dxa" w:w="60"/>
-              <w:right w:type="dxa" w:w="90"/>
-            </w:tcMar>
-          </w:tcPr>
-          <w:p>
-            <w:pPr>
-              <w:spacing w:after="0"/>
-            </w:pPr>
-            <w:r>
-              <w:rPr>
-                <w:rFonts w:ascii="Georgia" w:cs="Georgia" w:eastAsia="Georgia" w:hAnsi="Georgia"/>
-                <w:sz w:val="21"/>
-                <w:szCs w:val="21"/>
-              </w:rPr>
-              <w:t xml:space="preserve">−1.57</w:t>
-            </w:r>
-          </w:p>
-        </w:tc>
-        <w:tc>
-          <w:tcPr>
-            <w:tcW w:type="dxa" w:w="1560"/>
-            <w:tcMar>
-              <w:top w:type="dxa" w:w="60"/>
-              <w:left w:type="dxa" w:w="90"/>
-              <w:bottom w:type="dxa" w:w="60"/>
-              <w:right w:type="dxa" w:w="90"/>
-            </w:tcMar>
-          </w:tcPr>
-          <w:p>
-            <w:pPr>
-              <w:spacing w:after="0"/>
-            </w:pPr>
-            <w:r>
-              <w:rPr>
-                <w:rFonts w:ascii="Georgia" w:cs="Georgia" w:eastAsia="Georgia" w:hAnsi="Georgia"/>
-                <w:b/>
-                <w:bCs/>
-                <w:sz w:val="21"/>
-                <w:szCs w:val="21"/>
-              </w:rPr>
-              <w:t xml:space="preserve">0.50</w:t>
+            <w:tcW w:type="dxa" w:w="1872"/>
+            <w:tcMar>
+              <w:top w:type="dxa" w:w="60"/>
+              <w:left w:type="dxa" w:w="90"/>
+              <w:bottom w:type="dxa" w:w="60"/>
+              <w:right w:type="dxa" w:w="90"/>
+            </w:tcMar>
+          </w:tcPr>
+          <w:p>
+            <w:pPr>
+              <w:spacing w:after="0"/>
+            </w:pPr>
+            <w:r>
+              <w:rPr>
+                <w:rFonts w:ascii="Georgia" w:cs="Georgia" w:eastAsia="Georgia" w:hAnsi="Georgia"/>
+                <w:sz w:val="21"/>
+                <w:szCs w:val="21"/>
+              </w:rPr>
+              <w:t xml:space="preserve">20.4% ±5.0, z = −0.92</w:t>
+            </w:r>
+          </w:p>
+        </w:tc>
+        <w:tc>
+          <w:tcPr>
+            <w:tcW w:type="dxa" w:w="1872"/>
+            <w:tcMar>
+              <w:top w:type="dxa" w:w="60"/>
+              <w:left w:type="dxa" w:w="90"/>
+              <w:bottom w:type="dxa" w:w="60"/>
+              <w:right w:type="dxa" w:w="90"/>
+            </w:tcMar>
+          </w:tcPr>
+          <w:p>
+            <w:pPr>
+              <w:spacing w:after="0"/>
+            </w:pPr>
+            <w:r>
+              <w:rPr>
+                <w:rFonts w:ascii="Georgia" w:cs="Georgia" w:eastAsia="Georgia" w:hAnsi="Georgia"/>
+                <w:sz w:val="21"/>
+                <w:szCs w:val="21"/>
+              </w:rPr>
+              <w:t xml:space="preserve">25.6% ±5.4, z = −2.29</w:t>
             </w:r>
           </w:p>
         </w:tc>
@@ -3346,7 +3290,7 @@
         </w:trPr>
         <w:tc>
           <w:tcPr>
-            <w:tcW w:type="dxa" w:w="1560"/>
+            <w:tcW w:type="dxa" w:w="1872"/>
             <w:tcMar>
               <w:top w:type="dxa" w:w="60"/>
               <w:left w:type="dxa" w:w="90"/>
@@ -3370,7 +3314,7 @@
         </w:tc>
         <w:tc>
           <w:tcPr>
-            <w:tcW w:type="dxa" w:w="1560"/>
+            <w:tcW w:type="dxa" w:w="1872"/>
             <w:tcMar>
               <w:top w:type="dxa" w:w="60"/>
               <w:left w:type="dxa" w:w="90"/>
@@ -3394,99 +3338,73 @@
         </w:tc>
         <w:tc>
           <w:tcPr>
-            <w:tcW w:type="dxa" w:w="1560"/>
-            <w:tcMar>
-              <w:top w:type="dxa" w:w="60"/>
-              <w:left w:type="dxa" w:w="90"/>
-              <w:bottom w:type="dxa" w:w="60"/>
-              <w:right w:type="dxa" w:w="90"/>
-            </w:tcMar>
-          </w:tcPr>
-          <w:p>
-            <w:pPr>
-              <w:spacing w:after="0"/>
-            </w:pPr>
-            <w:r>
-              <w:rPr>
-                <w:rFonts w:ascii="Georgia" w:cs="Georgia" w:eastAsia="Georgia" w:hAnsi="Georgia"/>
-                <w:sz w:val="21"/>
-                <w:szCs w:val="21"/>
-              </w:rPr>
-              <w:t xml:space="preserve">28.5% ±4.4</w:t>
-            </w:r>
-          </w:p>
-        </w:tc>
-        <w:tc>
-          <w:tcPr>
-            <w:tcW w:type="dxa" w:w="1560"/>
-            <w:tcMar>
-              <w:top w:type="dxa" w:w="60"/>
-              <w:left w:type="dxa" w:w="90"/>
-              <w:bottom w:type="dxa" w:w="60"/>
-              <w:right w:type="dxa" w:w="90"/>
-            </w:tcMar>
-          </w:tcPr>
-          <w:p>
-            <w:pPr>
-              <w:spacing w:after="0"/>
-            </w:pPr>
-            <w:r>
-              <w:rPr>
-                <w:rFonts w:ascii="Georgia" w:cs="Georgia" w:eastAsia="Georgia" w:hAnsi="Georgia"/>
-                <w:sz w:val="21"/>
-                <w:szCs w:val="21"/>
-              </w:rPr>
-              <w:t xml:space="preserve">44.4% ±6.2</w:t>
-            </w:r>
-          </w:p>
-        </w:tc>
-        <w:tc>
-          <w:tcPr>
-            <w:tcW w:type="dxa" w:w="1560"/>
-            <w:tcMar>
-              <w:top w:type="dxa" w:w="60"/>
-              <w:left w:type="dxa" w:w="90"/>
-              <w:bottom w:type="dxa" w:w="60"/>
-              <w:right w:type="dxa" w:w="90"/>
-            </w:tcMar>
-          </w:tcPr>
-          <w:p>
-            <w:pPr>
-              <w:spacing w:after="0"/>
-            </w:pPr>
-            <w:r>
-              <w:rPr>
-                <w:rFonts w:ascii="Georgia" w:cs="Georgia" w:eastAsia="Georgia" w:hAnsi="Georgia"/>
-                <w:b/>
-                <w:bCs/>
-                <w:sz w:val="21"/>
-                <w:szCs w:val="21"/>
-              </w:rPr>
-              <w:t xml:space="preserve">−4.15</w:t>
-            </w:r>
-          </w:p>
-        </w:tc>
-        <w:tc>
-          <w:tcPr>
-            <w:tcW w:type="dxa" w:w="1560"/>
-            <w:tcMar>
-              <w:top w:type="dxa" w:w="60"/>
-              <w:left w:type="dxa" w:w="90"/>
-              <w:bottom w:type="dxa" w:w="60"/>
-              <w:right w:type="dxa" w:w="90"/>
-            </w:tcMar>
-          </w:tcPr>
-          <w:p>
-            <w:pPr>
-              <w:spacing w:after="0"/>
-            </w:pPr>
-            <w:r>
-              <w:rPr>
-                <w:rFonts w:ascii="Georgia" w:cs="Georgia" w:eastAsia="Georgia" w:hAnsi="Georgia"/>
-                <w:sz w:val="21"/>
-                <w:szCs w:val="21"/>
-              </w:rPr>
-              <w:t xml:space="preserve"/>
+            <w:tcW w:type="dxa" w:w="1872"/>
+            <w:tcMar>
+              <w:top w:type="dxa" w:w="60"/>
+              <w:left w:type="dxa" w:w="90"/>
+              <w:bottom w:type="dxa" w:w="60"/>
+              <w:right w:type="dxa" w:w="90"/>
+            </w:tcMar>
+          </w:tcPr>
+          <w:p>
+            <w:pPr>
+              <w:spacing w:after="0"/>
+            </w:pPr>
+            <w:r>
+              <w:rPr>
+                <w:rFonts w:ascii="Georgia" w:cs="Georgia" w:eastAsia="Georgia" w:hAnsi="Georgia"/>
+                <w:sz w:val="21"/>
+                <w:szCs w:val="21"/>
+              </w:rPr>
+              <w:t xml:space="preserve">28.5% ±4.4 (n=400)</w:t>
+            </w:r>
+          </w:p>
+        </w:tc>
+        <w:tc>
+          <w:tcPr>
+            <w:tcW w:type="dxa" w:w="1872"/>
+            <w:tcMar>
+              <w:top w:type="dxa" w:w="60"/>
+              <w:left w:type="dxa" w:w="90"/>
+              <w:bottom w:type="dxa" w:w="60"/>
+              <w:right w:type="dxa" w:w="90"/>
+            </w:tcMar>
+          </w:tcPr>
+          <w:p>
+            <w:pPr>
+              <w:spacing w:after="0"/>
+            </w:pPr>
+            <w:r>
+              <w:rPr>
+                <w:rFonts w:ascii="Georgia" w:cs="Georgia" w:eastAsia="Georgia" w:hAnsi="Georgia"/>
+                <w:sz w:val="21"/>
+                <w:szCs w:val="21"/>
+              </w:rPr>
+              <w:t xml:space="preserve">11.6% ±4.0, z = +5.06</w:t>
+            </w:r>
+          </w:p>
+        </w:tc>
+        <w:tc>
+          <w:tcPr>
+            <w:tcW w:type="dxa" w:w="1872"/>
+            <w:tcMar>
+              <w:top w:type="dxa" w:w="60"/>
+              <w:left w:type="dxa" w:w="90"/>
+              <w:bottom w:type="dxa" w:w="60"/>
+              <w:right w:type="dxa" w:w="90"/>
+            </w:tcMar>
+          </w:tcPr>
+          <w:p>
+            <w:pPr>
+              <w:spacing w:after="0"/>
+            </w:pPr>
+            <w:r>
+              <w:rPr>
+                <w:rFonts w:ascii="Georgia" w:cs="Georgia" w:eastAsia="Georgia" w:hAnsi="Georgia"/>
+                <w:sz w:val="21"/>
+                <w:szCs w:val="21"/>
+              </w:rPr>
+              <w:t xml:space="preserve">16.4% ±4.6, z = +3.52</w:t>
             </w:r>
           </w:p>
         </w:tc>
@@ -3497,7 +3415,7 @@
         </w:trPr>
         <w:tc>
           <w:tcPr>
-            <w:tcW w:type="dxa" w:w="1560"/>
+            <w:tcW w:type="dxa" w:w="1872"/>
             <w:tcMar>
               <w:top w:type="dxa" w:w="60"/>
               <w:left w:type="dxa" w:w="90"/>
@@ -3521,7 +3439,7 @@
         </w:tc>
         <w:tc>
           <w:tcPr>
-            <w:tcW w:type="dxa" w:w="1560"/>
+            <w:tcW w:type="dxa" w:w="1872"/>
             <w:tcMar>
               <w:top w:type="dxa" w:w="60"/>
               <w:left w:type="dxa" w:w="90"/>
@@ -3545,7 +3463,7 @@
         </w:tc>
         <w:tc>
           <w:tcPr>
-            <w:tcW w:type="dxa" w:w="1560"/>
+            <w:tcW w:type="dxa" w:w="1872"/>
             <w:tcMar>
               <w:top w:type="dxa" w:w="60"/>
               <w:left w:type="dxa" w:w="90"/>
@@ -3569,73 +3487,49 @@
         </w:tc>
         <w:tc>
           <w:tcPr>
-            <w:tcW w:type="dxa" w:w="1560"/>
-            <w:tcMar>
-              <w:top w:type="dxa" w:w="60"/>
-              <w:left w:type="dxa" w:w="90"/>
-              <w:bottom w:type="dxa" w:w="60"/>
-              <w:right w:type="dxa" w:w="90"/>
-            </w:tcMar>
-          </w:tcPr>
-          <w:p>
-            <w:pPr>
-              <w:spacing w:after="0"/>
-            </w:pPr>
-            <w:r>
-              <w:rPr>
-                <w:rFonts w:ascii="Georgia" w:cs="Georgia" w:eastAsia="Georgia" w:hAnsi="Georgia"/>
-                <w:sz w:val="21"/>
-                <w:szCs w:val="21"/>
-              </w:rPr>
-              <w:t xml:space="preserve">21.2% / 26.4%</w:t>
-            </w:r>
-          </w:p>
-        </w:tc>
-        <w:tc>
-          <w:tcPr>
-            <w:tcW w:type="dxa" w:w="1560"/>
-            <w:tcMar>
-              <w:top w:type="dxa" w:w="60"/>
-              <w:left w:type="dxa" w:w="90"/>
-              <w:bottom w:type="dxa" w:w="60"/>
-              <w:right w:type="dxa" w:w="90"/>
-            </w:tcMar>
-          </w:tcPr>
-          <w:p>
-            <w:pPr>
-              <w:spacing w:after="0"/>
-            </w:pPr>
-            <w:r>
-              <w:rPr>
-                <w:rFonts w:ascii="Georgia" w:cs="Georgia" w:eastAsia="Georgia" w:hAnsi="Georgia"/>
-                <w:sz w:val="21"/>
-                <w:szCs w:val="21"/>
-              </w:rPr>
-              <w:t xml:space="preserve">+1.18 / −0.33</w:t>
-            </w:r>
-          </w:p>
-        </w:tc>
-        <w:tc>
-          <w:tcPr>
-            <w:tcW w:type="dxa" w:w="1560"/>
-            <w:tcMar>
-              <w:top w:type="dxa" w:w="60"/>
-              <w:left w:type="dxa" w:w="90"/>
-              <w:bottom w:type="dxa" w:w="60"/>
-              <w:right w:type="dxa" w:w="90"/>
-            </w:tcMar>
-          </w:tcPr>
-          <w:p>
-            <w:pPr>
-              <w:spacing w:after="0"/>
-            </w:pPr>
-            <w:r>
-              <w:rPr>
-                <w:rFonts w:ascii="Georgia" w:cs="Georgia" w:eastAsia="Georgia" w:hAnsi="Georgia"/>
-                <w:sz w:val="21"/>
-                <w:szCs w:val="21"/>
-              </w:rPr>
-              <w:t xml:space="preserve">1.09</w:t>
+            <w:tcW w:type="dxa" w:w="1872"/>
+            <w:tcMar>
+              <w:top w:type="dxa" w:w="60"/>
+              <w:left w:type="dxa" w:w="90"/>
+              <w:bottom w:type="dxa" w:w="60"/>
+              <w:right w:type="dxa" w:w="90"/>
+            </w:tcMar>
+          </w:tcPr>
+          <w:p>
+            <w:pPr>
+              <w:spacing w:after="0"/>
+            </w:pPr>
+            <w:r>
+              <w:rPr>
+                <w:rFonts w:ascii="Georgia" w:cs="Georgia" w:eastAsia="Georgia" w:hAnsi="Georgia"/>
+                <w:sz w:val="21"/>
+                <w:szCs w:val="21"/>
+              </w:rPr>
+              <w:t xml:space="preserve">26.4% ±5.5, z = −0.33</w:t>
+            </w:r>
+          </w:p>
+        </w:tc>
+        <w:tc>
+          <w:tcPr>
+            <w:tcW w:type="dxa" w:w="1872"/>
+            <w:tcMar>
+              <w:top w:type="dxa" w:w="60"/>
+              <w:left w:type="dxa" w:w="90"/>
+              <w:bottom w:type="dxa" w:w="60"/>
+              <w:right w:type="dxa" w:w="90"/>
+            </w:tcMar>
+          </w:tcPr>
+          <w:p>
+            <w:pPr>
+              <w:spacing w:after="0"/>
+            </w:pPr>
+            <w:r>
+              <w:rPr>
+                <w:rFonts w:ascii="Georgia" w:cs="Georgia" w:eastAsia="Georgia" w:hAnsi="Georgia"/>
+                <w:sz w:val="21"/>
+                <w:szCs w:val="21"/>
+              </w:rPr>
+              <w:t xml:space="preserve">21.2% ±5.1, z = +1.18</w:t>
             </w:r>
           </w:p>
         </w:tc>
@@ -3646,7 +3540,7 @@
         </w:trPr>
         <w:tc>
           <w:tcPr>
-            <w:tcW w:type="dxa" w:w="1560"/>
+            <w:tcW w:type="dxa" w:w="1872"/>
             <w:tcMar>
               <w:top w:type="dxa" w:w="60"/>
               <w:left w:type="dxa" w:w="90"/>
@@ -3670,7 +3564,7 @@
         </w:tc>
         <w:tc>
           <w:tcPr>
-            <w:tcW w:type="dxa" w:w="1560"/>
+            <w:tcW w:type="dxa" w:w="1872"/>
             <w:tcMar>
               <w:top w:type="dxa" w:w="60"/>
               <w:left w:type="dxa" w:w="90"/>
@@ -3694,7 +3588,7 @@
         </w:tc>
         <w:tc>
           <w:tcPr>
-            <w:tcW w:type="dxa" w:w="1560"/>
+            <w:tcW w:type="dxa" w:w="1872"/>
             <w:tcMar>
               <w:top w:type="dxa" w:w="60"/>
               <w:left w:type="dxa" w:w="90"/>
@@ -3718,73 +3612,49 @@
         </w:tc>
         <w:tc>
           <w:tcPr>
-            <w:tcW w:type="dxa" w:w="1560"/>
-            <w:tcMar>
-              <w:top w:type="dxa" w:w="60"/>
-              <w:left w:type="dxa" w:w="90"/>
-              <w:bottom w:type="dxa" w:w="60"/>
-              <w:right w:type="dxa" w:w="90"/>
-            </w:tcMar>
-          </w:tcPr>
-          <w:p>
-            <w:pPr>
-              <w:spacing w:after="0"/>
-            </w:pPr>
-            <w:r>
-              <w:rPr>
-                <w:rFonts w:ascii="Georgia" w:cs="Georgia" w:eastAsia="Georgia" w:hAnsi="Georgia"/>
-                <w:sz w:val="21"/>
-                <w:szCs w:val="21"/>
-              </w:rPr>
-              <w:t xml:space="preserve">14.2% ±6.2</w:t>
-            </w:r>
-          </w:p>
-        </w:tc>
-        <w:tc>
-          <w:tcPr>
-            <w:tcW w:type="dxa" w:w="1560"/>
-            <w:tcMar>
-              <w:top w:type="dxa" w:w="60"/>
-              <w:left w:type="dxa" w:w="90"/>
-              <w:bottom w:type="dxa" w:w="60"/>
-              <w:right w:type="dxa" w:w="90"/>
-            </w:tcMar>
-          </w:tcPr>
-          <w:p>
-            <w:pPr>
-              <w:spacing w:after="0"/>
-            </w:pPr>
-            <w:r>
-              <w:rPr>
-                <w:rFonts w:ascii="Georgia" w:cs="Georgia" w:eastAsia="Georgia" w:hAnsi="Georgia"/>
-                <w:sz w:val="21"/>
-                <w:szCs w:val="21"/>
-              </w:rPr>
-              <w:t xml:space="preserve">+0.36</w:t>
-            </w:r>
-          </w:p>
-        </w:tc>
-        <w:tc>
-          <w:tcPr>
-            <w:tcW w:type="dxa" w:w="1560"/>
-            <w:tcMar>
-              <w:top w:type="dxa" w:w="60"/>
-              <w:left w:type="dxa" w:w="90"/>
-              <w:bottom w:type="dxa" w:w="60"/>
-              <w:right w:type="dxa" w:w="90"/>
-            </w:tcMar>
-          </w:tcPr>
-          <w:p>
-            <w:pPr>
-              <w:spacing w:after="0"/>
-            </w:pPr>
-            <w:r>
-              <w:rPr>
-                <w:rFonts w:ascii="Georgia" w:cs="Georgia" w:eastAsia="Georgia" w:hAnsi="Georgia"/>
-                <w:sz w:val="21"/>
-                <w:szCs w:val="21"/>
-              </w:rPr>
-              <w:t xml:space="preserve">0.79</w:t>
+            <w:tcW w:type="dxa" w:w="1872"/>
+            <w:tcMar>
+              <w:top w:type="dxa" w:w="60"/>
+              <w:left w:type="dxa" w:w="90"/>
+              <w:bottom w:type="dxa" w:w="60"/>
+              <w:right w:type="dxa" w:w="90"/>
+            </w:tcMar>
+          </w:tcPr>
+          <w:p>
+            <w:pPr>
+              <w:spacing w:after="0"/>
+            </w:pPr>
+            <w:r>
+              <w:rPr>
+                <w:rFonts w:ascii="Georgia" w:cs="Georgia" w:eastAsia="Georgia" w:hAnsi="Georgia"/>
+                <w:sz w:val="21"/>
+                <w:szCs w:val="21"/>
+              </w:rPr>
+              <w:t xml:space="preserve">not measured</w:t>
+            </w:r>
+          </w:p>
+        </w:tc>
+        <w:tc>
+          <w:tcPr>
+            <w:tcW w:type="dxa" w:w="1872"/>
+            <w:tcMar>
+              <w:top w:type="dxa" w:w="60"/>
+              <w:left w:type="dxa" w:w="90"/>
+              <w:bottom w:type="dxa" w:w="60"/>
+              <w:right w:type="dxa" w:w="90"/>
+            </w:tcMar>
+          </w:tcPr>
+          <w:p>
+            <w:pPr>
+              <w:spacing w:after="0"/>
+            </w:pPr>
+            <w:r>
+              <w:rPr>
+                <w:rFonts w:ascii="Georgia" w:cs="Georgia" w:eastAsia="Georgia" w:hAnsi="Georgia"/>
+                <w:sz w:val="21"/>
+                <w:szCs w:val="21"/>
+              </w:rPr>
+              <w:t xml:space="preserve">14.2% ±6.2, z = +0.36</w:t>
             </w:r>
           </w:p>
         </w:tc>
@@ -3795,7 +3665,7 @@
         </w:trPr>
         <w:tc>
           <w:tcPr>
-            <w:tcW w:type="dxa" w:w="1560"/>
+            <w:tcW w:type="dxa" w:w="1872"/>
             <w:tcMar>
               <w:top w:type="dxa" w:w="60"/>
               <w:left w:type="dxa" w:w="90"/>
@@ -3819,7 +3689,7 @@
         </w:tc>
         <w:tc>
           <w:tcPr>
-            <w:tcW w:type="dxa" w:w="1560"/>
+            <w:tcW w:type="dxa" w:w="1872"/>
             <w:tcMar>
               <w:top w:type="dxa" w:w="60"/>
               <w:left w:type="dxa" w:w="90"/>
@@ -3843,7 +3713,7 @@
         </w:tc>
         <w:tc>
           <w:tcPr>
-            <w:tcW w:type="dxa" w:w="1560"/>
+            <w:tcW w:type="dxa" w:w="1872"/>
             <w:tcMar>
               <w:top w:type="dxa" w:w="60"/>
               <w:left w:type="dxa" w:w="90"/>
@@ -3867,73 +3737,49 @@
         </w:tc>
         <w:tc>
           <w:tcPr>
-            <w:tcW w:type="dxa" w:w="1560"/>
-            <w:tcMar>
-              <w:top w:type="dxa" w:w="60"/>
-              <w:left w:type="dxa" w:w="90"/>
-              <w:bottom w:type="dxa" w:w="60"/>
-              <w:right w:type="dxa" w:w="90"/>
-            </w:tcMar>
-          </w:tcPr>
-          <w:p>
-            <w:pPr>
-              <w:spacing w:after="0"/>
-            </w:pPr>
-            <w:r>
-              <w:rPr>
-                <w:rFonts w:ascii="Georgia" w:cs="Georgia" w:eastAsia="Georgia" w:hAnsi="Georgia"/>
-                <w:sz w:val="21"/>
-                <w:szCs w:val="21"/>
-              </w:rPr>
-              <w:t xml:space="preserve">20.7% / 9.1%</w:t>
-            </w:r>
-          </w:p>
-        </w:tc>
-        <w:tc>
-          <w:tcPr>
-            <w:tcW w:type="dxa" w:w="1560"/>
-            <w:tcMar>
-              <w:top w:type="dxa" w:w="60"/>
-              <w:left w:type="dxa" w:w="90"/>
-              <w:bottom w:type="dxa" w:w="60"/>
-              <w:right w:type="dxa" w:w="90"/>
-            </w:tcMar>
-          </w:tcPr>
-          <w:p>
-            <w:pPr>
-              <w:spacing w:after="0"/>
-            </w:pPr>
-            <w:r>
-              <w:rPr>
-                <w:rFonts w:ascii="Georgia" w:cs="Georgia" w:eastAsia="Georgia" w:hAnsi="Georgia"/>
-                <w:sz w:val="21"/>
-                <w:szCs w:val="21"/>
-              </w:rPr>
-              <w:t xml:space="preserve">—</w:t>
-            </w:r>
-          </w:p>
-        </w:tc>
-        <w:tc>
-          <w:tcPr>
-            <w:tcW w:type="dxa" w:w="1560"/>
-            <w:tcMar>
-              <w:top w:type="dxa" w:w="60"/>
-              <w:left w:type="dxa" w:w="90"/>
-              <w:bottom w:type="dxa" w:w="60"/>
-              <w:right w:type="dxa" w:w="90"/>
-            </w:tcMar>
-          </w:tcPr>
-          <w:p>
-            <w:pPr>
-              <w:spacing w:after="0"/>
-            </w:pPr>
-            <w:r>
-              <w:rPr>
-                <w:rFonts w:ascii="Georgia" w:cs="Georgia" w:eastAsia="Georgia" w:hAnsi="Georgia"/>
-                <w:sz w:val="21"/>
-                <w:szCs w:val="21"/>
-              </w:rPr>
-              <w:t xml:space="preserve">—</w:t>
+            <w:tcW w:type="dxa" w:w="1872"/>
+            <w:tcMar>
+              <w:top w:type="dxa" w:w="60"/>
+              <w:left w:type="dxa" w:w="90"/>
+              <w:bottom w:type="dxa" w:w="60"/>
+              <w:right w:type="dxa" w:w="90"/>
+            </w:tcMar>
+          </w:tcPr>
+          <w:p>
+            <w:pPr>
+              <w:spacing w:after="0"/>
+            </w:pPr>
+            <w:r>
+              <w:rPr>
+                <w:rFonts w:ascii="Georgia" w:cs="Georgia" w:eastAsia="Georgia" w:hAnsi="Georgia"/>
+                <w:sz w:val="21"/>
+                <w:szCs w:val="21"/>
+              </w:rPr>
+              <w:t xml:space="preserve">9.1%, z = +8.01</w:t>
+            </w:r>
+          </w:p>
+        </w:tc>
+        <w:tc>
+          <w:tcPr>
+            <w:tcW w:type="dxa" w:w="1872"/>
+            <w:tcMar>
+              <w:top w:type="dxa" w:w="60"/>
+              <w:left w:type="dxa" w:w="90"/>
+              <w:bottom w:type="dxa" w:w="60"/>
+              <w:right w:type="dxa" w:w="90"/>
+            </w:tcMar>
+          </w:tcPr>
+          <w:p>
+            <w:pPr>
+              <w:spacing w:after="0"/>
+            </w:pPr>
+            <w:r>
+              <w:rPr>
+                <w:rFonts w:ascii="Georgia" w:cs="Georgia" w:eastAsia="Georgia" w:hAnsi="Georgia"/>
+                <w:sz w:val="21"/>
+                <w:szCs w:val="21"/>
+              </w:rPr>
+              <w:t xml:space="preserve">20.7%, z = −6.83</w:t>
             </w:r>
           </w:p>
         </w:tc>
@@ -3955,7 +3801,7 @@
           <w:sz w:val="21"/>
           <w:szCs w:val="21"/>
         </w:rPr>
-        <w:t xml:space="preserve">Three deserve comment.</w:t>
+        <w:t xml:space="preserve">Not one row shows MCP servers worse than a coverage-matched control. Four deserve comment, and two of those are cautions against reading the table too favourably.</w:t>
       </w:r>
     </w:p>
     <w:p>
@@ -3971,15 +3817,15 @@
           <w:sz w:val="21"/>
           <w:szCs w:val="21"/>
         </w:rPr>
-        <w:t xml:space="preserve">Deprecated dependencies (row 3).</w:t>
-      </w:r>
-      <w:r>
-        <w:rPr>
-          <w:rFonts w:ascii="Georgia" w:cs="Georgia" w:eastAsia="Georgia" w:hAnsi="Georgia"/>
-          <w:sz w:val="21"/>
-          <w:szCs w:val="21"/>
-        </w:rPr>
-        <w:t xml:space="preserve"> A raw rate of 17.2% looks alarming alone. Against a shape-matched control it is lower than baseline, and stratified on tree size the odds ratio is 0.50. Deprecation exposure is a function of how many packages you install.</w:t>
+        <w:t xml:space="preserve">Licensing (rows 1 and 2).</w:t>
+      </w:r>
+      <w:r>
+        <w:rPr>
+          <w:rFonts w:ascii="Georgia" w:cs="Georgia" w:eastAsia="Georgia" w:hAnsi="Georgia"/>
+          <w:sz w:val="21"/>
+          <w:szCs w:val="21"/>
+        </w:rPr>
+        <w:t xml:space="preserve"> MCP servers omit a license file at 22.2% against 36.4% and 50.0%. Both differences are large and significant. We do not claim MCP servers are better licensed, because our MCP frame covers 64% of its population and is score-ordered, while langchain covers 100%. That residual mismatch is the same top-slice bias Section 6 describes, running this time in MCP's favour. The defensible statement is that MCP servers are not worse.</w:t>
       </w:r>
     </w:p>
     <w:p>
@@ -3995,6 +3841,62 @@
           <w:sz w:val="21"/>
           <w:szCs w:val="21"/>
         </w:rPr>
+        <w:t xml:space="preserve">Deprecated dependencies (row 3).</w:t>
+      </w:r>
+      <w:r>
+        <w:rPr>
+          <w:rFonts w:ascii="Georgia" w:cs="Georgia" w:eastAsia="Georgia" w:hAnsi="Georgia"/>
+          <w:sz w:val="21"/>
+          <w:szCs w:val="21"/>
+        </w:rPr>
+        <w:t xml:space="preserve"> No control satisfies both requirements here. The coverage-matched frames have median tree sizes of 8 and 10 packages against MCP's 97, and a one-package tree cannot contain a deprecated dependency, so they understate the control. The shape-matched </w:t>
+      </w:r>
+      <w:r>
+        <w:rPr>
+          <w:rFonts w:ascii="Consolas" w:cs="Consolas" w:eastAsia="Consolas" w:hAnsi="Consolas"/>
+          <w:sz w:val="19"/>
+          <w:szCs w:val="19"/>
+        </w:rPr>
+        <w:t xml:space="preserve">cli</w:t>
+      </w:r>
+      <w:r>
+        <w:rPr>
+          <w:rFonts w:ascii="Georgia" w:cs="Georgia" w:eastAsia="Georgia" w:hAnsi="Georgia"/>
+          <w:sz w:val="21"/>
+          <w:szCs w:val="21"/>
+        </w:rPr>
+        <w:t xml:space="preserve">/</w:t>
+      </w:r>
+      <w:r>
+        <w:rPr>
+          <w:rFonts w:ascii="Consolas" w:cs="Consolas" w:eastAsia="Consolas" w:hAnsi="Consolas"/>
+          <w:sz w:val="19"/>
+          <w:szCs w:val="19"/>
+        </w:rPr>
+        <w:t xml:space="preserve">server</w:t>
+      </w:r>
+      <w:r>
+        <w:rPr>
+          <w:rFonts w:ascii="Georgia" w:cs="Georgia" w:eastAsia="Georgia" w:hAnsi="Georgia"/>
+          <w:sz w:val="21"/>
+          <w:szCs w:val="21"/>
+        </w:rPr>
+        <w:t xml:space="preserve"> frame has a median of 13 and a mean of 79, closer on shape but invalid on coverage; against it the tree-size-stratified odds ratio is 0.50. Both comparisons point the same way and neither is clean. What can be said is that MCP servers carry deprecated dependencies no more often than any control we have, despite installing more packages: ten times as many by median, though the control distributions are heavily right-skewed and by mean the langchain gap is only 1.6-fold.</w:t>
+      </w:r>
+    </w:p>
+    <w:p>
+      <w:pPr>
+        <w:spacing w:after="160"/>
+        <w:jc w:val="left"/>
+      </w:pPr>
+      <w:r>
+        <w:rPr>
+          <w:rFonts w:ascii="Georgia" w:cs="Georgia" w:eastAsia="Georgia" w:hAnsi="Georgia"/>
+          <w:b/>
+          <w:bCs/>
+          <w:sz w:val="21"/>
+          <w:szCs w:val="21"/>
+        </w:rPr>
         <w:t xml:space="preserve">Release churn (row 4).</w:t>
       </w:r>
       <w:r>
@@ -4003,7 +3905,31 @@
           <w:sz w:val="21"/>
           <w:szCs w:val="21"/>
         </w:rPr>
-        <w:t xml:space="preserve"> Significant in the opposite direction. MCP servers publish less often than comparable npm applications.</w:t>
+        <w:t xml:space="preserve"> In version 1.0.0 this was reported as significant in the opposite direction, MCP publishing less often than the control. That result came entirely from the invalid frame: a score-ordered top-slice selects for actively maintained packages, which inflates the control's recency. Against coverage-matched frames the sign reverses and MCP servers publish more often, z = +5.06 and +3.52. Note that the same residual bias in our MCP frame could inflate this figure too, so the safe reading is that MCP servers are not less maintained than comparable packages.</w:t>
+      </w:r>
+    </w:p>
+    <w:p>
+      <w:pPr>
+        <w:spacing w:after="160"/>
+        <w:jc w:val="left"/>
+      </w:pPr>
+      <w:r>
+        <w:rPr>
+          <w:rFonts w:ascii="Georgia" w:cs="Georgia" w:eastAsia="Georgia" w:hAnsi="Georgia"/>
+          <w:b/>
+          <w:bCs/>
+          <w:sz w:val="21"/>
+          <w:szCs w:val="21"/>
+        </w:rPr>
+        <w:t xml:space="preserve">Name collision (row 7).</w:t>
+      </w:r>
+      <w:r>
+        <w:rPr>
+          <w:rFonts w:ascii="Georgia" w:cs="Georgia" w:eastAsia="Georgia" w:hAnsi="Georgia"/>
+          <w:sz w:val="21"/>
+          <w:szCs w:val="21"/>
+        </w:rPr>
+        <w:t xml:space="preserve"> Not a null. MCP is significantly higher than eslint-plugin, z = +8.01, and significantly lower than langchain, z = −6.83. Version 1.0.0 printed this row with the z column blank, which understated what the measurement found. Collision rate scales with the size of the population a name has to be unique within, and langchain's population of 1,973 is 4.2 times smaller than the 7,075 and 8,227 of the other two arms, so the control that rescues a null reading is the one least comparable on the property that drives the metric. Against the comparably sized control MCP is worse. We report this as a bound, not as a null, and note that it is the dimension closest to the typosquatting outcomes this study does not measure.</w:t>
       </w:r>
     </w:p>
     <w:p>
@@ -4205,7 +4131,7 @@
           <w:sz w:val="23"/>
           <w:szCs w:val="23"/>
         </w:rPr>
-        <w:t xml:space="preserve">4.1 Why the nulls are consistent</w:t>
+        <w:t xml:space="preserve">4.1 Why the licensing dimensions do not separate</w:t>
       </w:r>
     </w:p>
     <w:p>
@@ -4283,7 +4209,7 @@
           <w:sz w:val="21"/>
           <w:szCs w:val="21"/>
         </w:rPr>
-        <w:t xml:space="preserve"> into every scaffolded package with no author decision, which sets the ceiling. It writes no LICENSE file, which is the direct cause of the roughly one-in-four rate at which npm packages of all kinds declare a license they do not ship.</w:t>
+        <w:t xml:space="preserve"> into every scaffolded package with no author decision, which sets the ceiling. It writes no LICENSE file, which is the direct cause of the rate at which npm packages of all kinds declare a license they do not ship. That rate is not one number: it is 21.2% for MCP servers, 36.0% for eslint-plugin packages and 49.2% for langchain packages. Version 1.0.0 gave it as roughly one in four, which was the withdrawn control's 24.8%.</w:t>
       </w:r>
     </w:p>
     <w:p>
@@ -4636,6 +4562,14 @@
               </w:rPr>
               <w:t xml:space="preserve">32.8% ±5.9</w:t>
             </w:r>
+            <w:r>
+              <w:rPr>
+                <w:rFonts w:ascii="Georgia" w:cs="Georgia" w:eastAsia="Georgia" w:hAnsi="Georgia"/>
+                <w:sz w:val="21"/>
+                <w:szCs w:val="21"/>
+              </w:rPr>
+              <w:t xml:space="preserve"> (81/247)</w:t>
+            </w:r>
           </w:p>
         </w:tc>
         <w:tc>
@@ -4661,6 +4595,14 @@
                 <w:szCs w:val="21"/>
               </w:rPr>
               <w:t xml:space="preserve">18.0% ±4.8</w:t>
+            </w:r>
+            <w:r>
+              <w:rPr>
+                <w:rFonts w:ascii="Georgia" w:cs="Georgia" w:eastAsia="Georgia" w:hAnsi="Georgia"/>
+                <w:sz w:val="21"/>
+                <w:szCs w:val="21"/>
+              </w:rPr>
+              <w:t xml:space="preserve"> (44/245)</w:t>
             </w:r>
           </w:p>
         </w:tc>
@@ -6200,6 +6142,30 @@
           <w:szCs w:val="21"/>
         </w:rPr>
         <w:t xml:space="preserve">Undetected, this error invalidated four earlier results before we caught it. Any study drawing an npm frame from the search API inherits it. We recommend matching coverage fractions explicitly across arms, or drawing frames from a source that enumerates completely, as the PyPI simple index does.</w:t>
+      </w:r>
+    </w:p>
+    <w:p>
+      <w:pPr>
+        <w:spacing w:after="160"/>
+        <w:jc w:val="left"/>
+      </w:pPr>
+      <w:r>
+        <w:rPr>
+          <w:rFonts w:ascii="Georgia" w:cs="Georgia" w:eastAsia="Georgia" w:hAnsi="Georgia"/>
+          <w:b/>
+          <w:bCs/>
+          <w:sz w:val="21"/>
+          <w:szCs w:val="21"/>
+        </w:rPr>
+        <w:t xml:space="preserve">We then made the same mistake again, in the same paper.</w:t>
+      </w:r>
+      <w:r>
+        <w:rPr>
+          <w:rFonts w:ascii="Georgia" w:cs="Georgia" w:eastAsia="Georgia" w:hAnsi="Georgia"/>
+          <w:sz w:val="21"/>
+          <w:szCs w:val="21"/>
+        </w:rPr>
+        <w:t xml:space="preserve"> Version 1.0.0 rebuilt rows 5 to 7 on coverage-matched frames and left rows 1 to 4 on the invalid one, while Section 2.1 described the whole table as coverage-matched. Re-measuring those four rows changed two of them, and one changed sign: release churn was reported as MCP publishing significantly less often, and against matched frames MCP publishes significantly more often. The lesson we would draw from our own case is that identifying a sampling error is not the same as removing it, and that the rows you do not re-run are the ones that keep it.</w:t>
       </w:r>
     </w:p>
     <w:p>
@@ -7246,15 +7212,15 @@
           <w:sz w:val="21"/>
           <w:szCs w:val="21"/>
         </w:rPr>
-        <w:t xml:space="preserve">13 of 15 clusters have a cleanly licensed option among their five most prominent members</w:t>
-      </w:r>
-      <w:r>
-        <w:rPr>
-          <w:rFonts w:ascii="Georgia" w:cs="Georgia" w:eastAsia="Georgia" w:hAnsi="Georgia"/>
-          <w:sz w:val="21"/>
-          <w:szCs w:val="21"/>
-        </w:rPr>
-        <w:t xml:space="preserve">, and the remaining two have three of five.</w:t>
+        <w:t xml:space="preserve">12 of 15 clusters have a cleanly licensed option in every one of their five most prominent members</w:t>
+      </w:r>
+      <w:r>
+        <w:rPr>
+          <w:rFonts w:ascii="Georgia" w:cs="Georgia" w:eastAsia="Georgia" w:hAnsi="Georgia"/>
+          <w:sz w:val="21"/>
+          <w:szCs w:val="21"/>
+        </w:rPr>
+        <w:t xml:space="preserve">, and the remaining three have four, three and four of five. All 15 have at least one clean option.</w:t>
       </w:r>
     </w:p>
     <w:p>
@@ -7292,7 +7258,7 @@
           <w:sz w:val="21"/>
           <w:szCs w:val="21"/>
         </w:rPr>
-        <w:t xml:space="preserve">The npm frame covers 64% of its population and is score-ordered. We found no hygiene gradient within it but cannot rule out that the excluded portion differs categorically.</w:t>
+        <w:t xml:space="preserve">The npm frame covers 64% of its population and is score-ordered. We found no hygiene gradient within it but cannot rule out that the excluded portion differs categorically. This matters more than it did in version 1.0.0: our control frames cover 74% and 100%, so the residual mismatch runs in MCP's favour on every dimension where prominence predicts hygiene. Rows 1, 2, 4 and 7 of Section 4 should be read as bounds rather than estimates. Row 7 in particular is prominence-sensitive and our frame is the most top-sliced of the three, so its true rate is if anything understated.</w:t>
       </w:r>
     </w:p>
     <w:p>
@@ -7306,7 +7272,23 @@
           <w:sz w:val="21"/>
           <w:szCs w:val="21"/>
         </w:rPr>
-        <w:t xml:space="preserve">Download data was obtained for PyPI only. The npm arm remains package-weighted, though Section 4.1 shows license quality does not vary with popularity there, so weighting would move those results little.</w:t>
+        <w:t xml:space="preserve">Two figures in this paper cannot be recomputed from the release. The score-quartile hygiene-gradient test in Section 2.1, r = −0.006 and r = −0.059, needs a per-package search rank that </w:t>
+      </w:r>
+      <w:r>
+        <w:rPr>
+          <w:rFonts w:ascii="Consolas" w:cs="Consolas" w:eastAsia="Consolas" w:hAnsi="Consolas"/>
+          <w:sz w:val="19"/>
+          <w:szCs w:val="19"/>
+        </w:rPr>
+        <w:t xml:space="preserve">npm_stage1_metadata</w:t>
+      </w:r>
+      <w:r>
+        <w:rPr>
+          <w:rFonts w:ascii="Georgia" w:cs="Georgia" w:eastAsia="Georgia" w:hAnsi="Georgia"/>
+          <w:sz w:val="21"/>
+          <w:szCs w:val="21"/>
+        </w:rPr>
+        <w:t xml:space="preserve"> does not carry; that test is the only defence of our 64% score-ordered frame, which version 1.0.1 leans on more heavily than 1.0.0 did. And the age-adjusted odds ratio of 1.84 in Section 6 is sensitive to the choice of age strata: standard bins give values near 1.0, and 1.84 is reachable only under the 561-day common-support restriction. The direction of that sensitivity is conservative, since a value nearer 1.0 strengthens rather than weakens the claim that the effect vanishes.</w:t>
       </w:r>
     </w:p>
     <w:p>
@@ -7320,7 +7302,39 @@
           <w:sz w:val="21"/>
           <w:szCs w:val="21"/>
         </w:rPr>
-        <w:t xml:space="preserve">The download sample is 221 packages from a 4,062-package frame at one point in time, and last-month counts include mirror and CI traffic, which inflates absolute figures without obviously biasing the comparison.</w:t>
+        <w:t xml:space="preserve">The released files disagree on one denominator. </w:t>
+      </w:r>
+      <w:r>
+        <w:rPr>
+          <w:rFonts w:ascii="Consolas" w:cs="Consolas" w:eastAsia="Consolas" w:hAnsi="Consolas"/>
+          <w:sz w:val="19"/>
+          <w:szCs w:val="19"/>
+        </w:rPr>
+        <w:t xml:space="preserve">mcp-confound-tests.json</w:t>
+      </w:r>
+      <w:r>
+        <w:rPr>
+          <w:rFonts w:ascii="Georgia" w:cs="Georgia" w:eastAsia="Georgia" w:hAnsi="Georgia"/>
+          <w:sz w:val="21"/>
+          <w:szCs w:val="21"/>
+        </w:rPr>
+        <w:t xml:space="preserve"> records the PyPI control as 44 of 245, giving 18.0%; </w:t>
+      </w:r>
+      <w:r>
+        <w:rPr>
+          <w:rFonts w:ascii="Consolas" w:cs="Consolas" w:eastAsia="Consolas" w:hAnsi="Consolas"/>
+          <w:sz w:val="19"/>
+          <w:szCs w:val="19"/>
+        </w:rPr>
+        <w:t xml:space="preserve">mcp-controls-data.json</w:t>
+      </w:r>
+      <w:r>
+        <w:rPr>
+          <w:rFonts w:ascii="Georgia" w:cs="Georgia" w:eastAsia="Georgia" w:hAnsi="Georgia"/>
+          <w:sz w:val="21"/>
+          <w:szCs w:val="21"/>
+        </w:rPr>
+        <w:t xml:space="preserve"> records 44 of 246, giving 17.9%. Section 5 uses 245. The difference moves z from +3.78 to +3.80 and changes nothing.</w:t>
       </w:r>
     </w:p>
     <w:p>
@@ -7334,7 +7348,7 @@
           <w:sz w:val="21"/>
           <w:szCs w:val="21"/>
         </w:rPr>
-        <w:t xml:space="preserve">Peer dependencies are excluded, so trees are undercounts. Docker-distributed servers are measured for usage concentration only (Section 3.1); their images were not inspected for license or maintenance metadata, so they contribute to no result in Sections 4 or 5.</w:t>
+        <w:t xml:space="preserve">No available frame is matched on both coverage and dependency-tree shape. The coverage-matched frames have median trees of 8 and 10 packages against MCP's 97; the shape-matched frame is a 2.4% top-slice. Row 3 is reported against both and is clean against neither.</w:t>
       </w:r>
     </w:p>
     <w:p>
@@ -7348,6 +7362,48 @@
           <w:sz w:val="21"/>
           <w:szCs w:val="21"/>
         </w:rPr>
+        <w:t xml:space="preserve">Download data was obtained for PyPI only. The npm arm remains package-weighted, though Section 4.1 shows license quality does not vary with popularity there, so weighting would move those results little.</w:t>
+      </w:r>
+    </w:p>
+    <w:p>
+      <w:pPr>
+        <w:spacing w:after="160"/>
+        <w:jc w:val="left"/>
+      </w:pPr>
+      <w:r>
+        <w:rPr>
+          <w:rFonts w:ascii="Georgia" w:cs="Georgia" w:eastAsia="Georgia" w:hAnsi="Georgia"/>
+          <w:sz w:val="21"/>
+          <w:szCs w:val="21"/>
+        </w:rPr>
+        <w:t xml:space="preserve">The download sample is 221 packages from a 4,062-package frame at one point in time, and last-month counts include mirror and CI traffic, which inflates absolute figures without obviously biasing the comparison.</w:t>
+      </w:r>
+    </w:p>
+    <w:p>
+      <w:pPr>
+        <w:spacing w:after="160"/>
+        <w:jc w:val="left"/>
+      </w:pPr>
+      <w:r>
+        <w:rPr>
+          <w:rFonts w:ascii="Georgia" w:cs="Georgia" w:eastAsia="Georgia" w:hAnsi="Georgia"/>
+          <w:sz w:val="21"/>
+          <w:szCs w:val="21"/>
+        </w:rPr>
+        <w:t xml:space="preserve">Peer dependencies are excluded, so trees are undercounts. Docker-distributed servers are measured for usage concentration only (Section 3.1); their images were not inspected for license or maintenance metadata, so they contribute to no result in Sections 4 or 5.</w:t>
+      </w:r>
+    </w:p>
+    <w:p>
+      <w:pPr>
+        <w:spacing w:after="160"/>
+        <w:jc w:val="left"/>
+      </w:pPr>
+      <w:r>
+        <w:rPr>
+          <w:rFonts w:ascii="Georgia" w:cs="Georgia" w:eastAsia="Georgia" w:hAnsi="Georgia"/>
+          <w:sz w:val="21"/>
+          <w:szCs w:val="21"/>
+        </w:rPr>
         <w:t xml:space="preserve">We measured license and maintenance metadata. We did not measure malware, typosquatting outcomes, prompt injection, tool poisoning, or runtime capability scope, which is where most published MCP security work sits. </w:t>
       </w:r>
       <w:r>
@@ -7358,7 +7414,7 @@
           <w:sz w:val="21"/>
           <w:szCs w:val="21"/>
         </w:rPr>
-        <w:t xml:space="preserve">Our nulls say nothing about those dimensions.</w:t>
+        <w:t xml:space="preserve">Our results say nothing about those dimensions.</w:t>
       </w:r>
     </w:p>
     <w:p>
@@ -7396,7 +7452,7 @@
           <w:sz w:val="21"/>
           <w:szCs w:val="21"/>
         </w:rPr>
-        <w:t xml:space="preserve">For anyone assessing MCP supply-chain risk on the dimensions a package registry exposes: this ecosystem is ordinary. Claims that it is unusually poorly licensed, unusually abandoned, or unusually prone to install-time code execution are not supported once matched controls are applied. The one dimension where a real difference exists affects 1.9% of installs.</w:t>
+        <w:t xml:space="preserve">For anyone assessing MCP supply-chain risk on the dimensions a package registry exposes: this ecosystem is not worse than its neighbours, and on licensing it is lower than both of our matched controls. Claims that it is unusually poorly licensed, unusually abandoned, or unusually prone to install-time code execution are not supported once coverage-matched controls are applied. The one dimension where a real difference exists affects 1.9% of installs. MCP servers do publish more often than comparable packages, which is a sign of activity rather than of risk.</w:t>
       </w:r>
     </w:p>
     <w:p>
@@ -7428,7 +7484,7 @@
           <w:sz w:val="21"/>
           <w:szCs w:val="21"/>
         </w:rPr>
-        <w:t xml:space="preserve">. With a Gini of 0.96 and a single package taking 63.6% of installs, per-package rates describe a long tail that is measured but not run. This applies to our own seven nulls as much as to the finding it dissolved, and it applies to any registry-scale study that samples uniformly.</w:t>
+        <w:t xml:space="preserve">. With a Gini of 0.96 and a single package taking 63.6% of installs, per-package rates describe a long tail that is measured but not run. This applies to our own npm results as much as to the finding it dissolved, and it applies to any registry-scale study that samples uniformly.</w:t>
       </w:r>
     </w:p>
     <w:p>
@@ -7538,7 +7594,25 @@
           <w:sz w:val="21"/>
           <w:szCs w:val="21"/>
         </w:rPr>
-        <w:t xml:space="preserve">Archived copy with a citable DOI: 10.5281/zenodo.22641813</w:t>
+        <w:t xml:space="preserve">DOI 10.5281/zenodo.22641813 archives </w:t>
+      </w:r>
+      <w:r>
+        <w:rPr>
+          <w:rFonts w:ascii="Georgia" w:cs="Georgia" w:eastAsia="Georgia" w:hAnsi="Georgia"/>
+          <w:b/>
+          <w:bCs/>
+          <w:sz w:val="21"/>
+          <w:szCs w:val="21"/>
+        </w:rPr>
+        <w:t xml:space="preserve">version 1.0.0</w:t>
+      </w:r>
+      <w:r>
+        <w:rPr>
+          <w:rFonts w:ascii="Georgia" w:cs="Georgia" w:eastAsia="Georgia" w:hAnsi="Georgia"/>
+          <w:sz w:val="21"/>
+          <w:szCs w:val="21"/>
+        </w:rPr>
+        <w:t xml:space="preserve">, which contains the</w:t>
       </w:r>
     </w:p>
     <w:p>
@@ -7555,7 +7629,41 @@
           <w:sz w:val="21"/>
           <w:szCs w:val="21"/>
         </w:rPr>
-        <w:t xml:space="preserve">https://doi.org/10.5281/zenodo.22641813</w:t>
+        <w:t xml:space="preserve">errors listed in Section 11. Version 1.0.1 is archived under its own DOI,</w:t>
+      </w:r>
+    </w:p>
+    <w:p>
+      <w:pPr>
+        <w:pBdr>
+          <w:left w:val="single" w:color="BBBBBB" w:sz="12" w:space="12"/>
+        </w:pBdr>
+        <w:spacing w:after="80"/>
+        <w:ind w:left="576"/>
+      </w:pPr>
+      <w:r>
+        <w:rPr>
+          <w:rFonts w:ascii="Georgia" w:cs="Georgia" w:eastAsia="Georgia" w:hAnsi="Georgia"/>
+          <w:sz w:val="21"/>
+          <w:szCs w:val="21"/>
+        </w:rPr>
+        <w:t xml:space="preserve">minted from the v1.0.1 tag; the Zenodo concept DOI always resolves to the</w:t>
+      </w:r>
+    </w:p>
+    <w:p>
+      <w:pPr>
+        <w:pBdr>
+          <w:left w:val="single" w:color="BBBBBB" w:sz="12" w:space="12"/>
+        </w:pBdr>
+        <w:spacing w:after="80"/>
+        <w:ind w:left="576"/>
+      </w:pPr>
+      <w:r>
+        <w:rPr>
+          <w:rFonts w:ascii="Georgia" w:cs="Georgia" w:eastAsia="Georgia" w:hAnsi="Georgia"/>
+          <w:sz w:val="21"/>
+          <w:szCs w:val="21"/>
+        </w:rPr>
+        <w:t xml:space="preserve">newest version.</w:t>
       </w:r>
     </w:p>
     <w:p>
@@ -7574,7 +7682,7 @@
           <w:sz w:val="21"/>
           <w:szCs w:val="21"/>
         </w:rPr>
-        <w:t xml:space="preserve">The repository contains eleven analysis scripts, the resolver library, and fourteen JSON datasets covering all four rounds of measurement, including the two runs that were later found invalid and the corrections applied to them. Nothing has been removed to make the result look cleaner.</w:t>
+        <w:t xml:space="preserve">The repository contains eleven analysis scripts plus the resolver library, and eighteen data files covering all four rounds of measurement, including the two runs that were later found invalid and the corrections applied to them. Nothing has been removed to make the result look cleaner.</w:t>
       </w:r>
     </w:p>
     <w:p>
@@ -7585,44 +7693,10 @@
       <w:r>
         <w:rPr>
           <w:rFonts w:ascii="Georgia" w:cs="Georgia" w:eastAsia="Georgia" w:hAnsi="Georgia"/>
-          <w:b/>
-          <w:bCs/>
-          <w:sz w:val="21"/>
-          <w:szCs w:val="21"/>
-        </w:rPr>
-        <w:t xml:space="preserve">Licensing.</w:t>
-      </w:r>
-      <w:r>
-        <w:rPr>
-          <w:rFonts w:ascii="Georgia" w:cs="Georgia" w:eastAsia="Georgia" w:hAnsi="Georgia"/>
-          <w:sz w:val="21"/>
-          <w:szCs w:val="21"/>
-        </w:rPr>
-        <w:t xml:space="preserve"> Code is released under Apache-2.0. Data is released under CC-BY-4.0. The datasets consist of factual metadata retrieved from public registry APIs, together with derived statistics; no third-party package source is redistributed.</w:t>
-      </w:r>
-    </w:p>
-    <w:p>
-      <w:pPr>
-        <w:spacing w:after="160"/>
-        <w:jc w:val="left"/>
-      </w:pPr>
-      <w:r>
-        <w:rPr>
-          <w:rFonts w:ascii="Georgia" w:cs="Georgia" w:eastAsia="Georgia" w:hAnsi="Georgia"/>
-          <w:b/>
-          <w:bCs/>
-          <w:sz w:val="21"/>
-          <w:szCs w:val="21"/>
-        </w:rPr>
-        <w:t xml:space="preserve">Provenance.</w:t>
-      </w:r>
-      <w:r>
-        <w:rPr>
-          <w:rFonts w:ascii="Georgia" w:cs="Georgia" w:eastAsia="Georgia" w:hAnsi="Georgia"/>
-          <w:sz w:val="21"/>
-          <w:szCs w:val="21"/>
-        </w:rPr>
-        <w:t xml:space="preserve"> The resolver uses only the public npm and PyPI registry APIs and the public Docker Hub repository API. Package trees were resolved with npm semver range semantics rather than by taking </w:t>
+          <w:sz w:val="21"/>
+          <w:szCs w:val="21"/>
+        </w:rPr>
+        <w:t xml:space="preserve">Four files were added in 1.0.1 to close reproducibility gaps a reader found in 1.0.0: </w:t>
       </w:r>
       <w:r>
         <w:rPr>
@@ -7630,15 +7704,15 @@
           <w:sz w:val="19"/>
           <w:szCs w:val="19"/>
         </w:rPr>
-        <w:t xml:space="preserve">latest</w:t>
-      </w:r>
-      <w:r>
-        <w:rPr>
-          <w:rFonts w:ascii="Georgia" w:cs="Georgia" w:eastAsia="Georgia" w:hAnsi="Georgia"/>
-          <w:sz w:val="21"/>
-          <w:szCs w:val="21"/>
-        </w:rPr>
-        <w:t xml:space="preserve">, which is why the round-one dataset is superseded. License detection uses the SPDX License List, 739 identifiers at time of measurement. Docker pull counts were taken one repository at a time from the 328-entry </w:t>
+        <w:t xml:space="preserve">pypi_weighted_result.json</w:t>
+      </w:r>
+      <w:r>
+        <w:rPr>
+          <w:rFonts w:ascii="Georgia" w:cs="Georgia" w:eastAsia="Georgia" w:hAnsi="Georgia"/>
+          <w:sz w:val="21"/>
+          <w:szCs w:val="21"/>
+        </w:rPr>
+        <w:t xml:space="preserve">, which carries the per-package download counts behind every figure in Section 3; </w:t>
       </w:r>
       <w:r>
         <w:rPr>
@@ -7646,87 +7720,15 @@
           <w:sz w:val="19"/>
           <w:szCs w:val="19"/>
         </w:rPr>
-        <w:t xml:space="preserve">docker/mcp-registry</w:t>
-      </w:r>
-      <w:r>
-        <w:rPr>
-          <w:rFonts w:ascii="Georgia" w:cs="Georgia" w:eastAsia="Georgia" w:hAnsi="Georgia"/>
-          <w:sz w:val="21"/>
-          <w:szCs w:val="21"/>
-        </w:rPr>
-        <w:t xml:space="preserve"> catalog, because the namespace listing endpoint silently ignores its ordering parameter (Section 6).</w:t>
-      </w:r>
-    </w:p>
-    <w:p>
-      <w:pPr>
-        <w:spacing w:after="160"/>
-        <w:jc w:val="left"/>
-      </w:pPr>
-      <w:r>
-        <w:rPr>
-          <w:rFonts w:ascii="Georgia" w:cs="Georgia" w:eastAsia="Georgia" w:hAnsi="Georgia"/>
-          <w:b/>
-          <w:bCs/>
-          <w:sz w:val="21"/>
-          <w:szCs w:val="21"/>
-        </w:rPr>
-        <w:t xml:space="preserve">Reproduction notes.</w:t>
-      </w:r>
-      <w:r>
-        <w:rPr>
-          <w:rFonts w:ascii="Georgia" w:cs="Georgia" w:eastAsia="Georgia" w:hAnsi="Georgia"/>
-          <w:sz w:val="21"/>
-          <w:szCs w:val="21"/>
-        </w:rPr>
-        <w:t xml:space="preserve"> Three things will otherwise reproduce our mistakes rather than our results.</w:t>
-      </w:r>
-    </w:p>
-    <w:p>
-      <w:pPr>
-        <w:spacing w:after="100"/>
-        <w:ind w:left="504" w:hanging="360"/>
-      </w:pPr>
-      <w:r>
-        <w:rPr>
-          <w:rFonts w:ascii="Georgia" w:cs="Georgia" w:eastAsia="Georgia" w:hAnsi="Georgia"/>
-          <w:b/>
-          <w:bCs/>
-          <w:sz w:val="21"/>
-          <w:szCs w:val="21"/>
-        </w:rPr>
-        <w:t xml:space="preserve">1.  </w:t>
-      </w:r>
-      <w:r>
-        <w:rPr>
-          <w:rFonts w:ascii="Georgia" w:cs="Georgia" w:eastAsia="Georgia" w:hAnsi="Georgia"/>
-          <w:sz w:val="21"/>
-          <w:szCs w:val="21"/>
-        </w:rPr>
-        <w:t xml:space="preserve">Do not build a sampling frame from the npm search API without matching coverage fractions across arms. Section 6 gives the false positive this produces, z = 7.32 for an effect that does not exist.</w:t>
-      </w:r>
-    </w:p>
-    <w:p>
-      <w:pPr>
-        <w:spacing w:after="100"/>
-        <w:ind w:left="504" w:hanging="360"/>
-      </w:pPr>
-      <w:r>
-        <w:rPr>
-          <w:rFonts w:ascii="Georgia" w:cs="Georgia" w:eastAsia="Georgia" w:hAnsi="Georgia"/>
-          <w:b/>
-          <w:bCs/>
-          <w:sz w:val="21"/>
-          <w:szCs w:val="21"/>
-        </w:rPr>
-        <w:t xml:space="preserve">2.  </w:t>
-      </w:r>
-      <w:r>
-        <w:rPr>
-          <w:rFonts w:ascii="Georgia" w:cs="Georgia" w:eastAsia="Georgia" w:hAnsi="Georgia"/>
-          <w:sz w:val="21"/>
-          <w:szCs w:val="21"/>
-        </w:rPr>
-        <w:t xml:space="preserve">Verify that an ordering parameter took effect before building anything on the result. Docker Hub accepts </w:t>
+        <w:t xml:space="preserve">walk250.jsonl</w:t>
+      </w:r>
+      <w:r>
+        <w:rPr>
+          <w:rFonts w:ascii="Georgia" w:cs="Georgia" w:eastAsia="Georgia" w:hAnsi="Georgia"/>
+          <w:sz w:val="21"/>
+          <w:szCs w:val="21"/>
+        </w:rPr>
+        <w:t xml:space="preserve">, which carries package-level attribution for the 250 MCP dependency trees and is what makes row 3 recomputable; </w:t>
       </w:r>
       <w:r>
         <w:rPr>
@@ -7734,15 +7736,151 @@
           <w:sz w:val="19"/>
           <w:szCs w:val="19"/>
         </w:rPr>
-        <w:t xml:space="preserve">ordering=-pull_count</w:t>
-      </w:r>
-      <w:r>
-        <w:rPr>
-          <w:rFonts w:ascii="Georgia" w:cs="Georgia" w:eastAsia="Georgia" w:hAnsi="Georgia"/>
-          <w:sz w:val="21"/>
-          <w:szCs w:val="21"/>
-        </w:rPr>
-        <w:t xml:space="preserve"> and ignores it.</w:t>
+        <w:t xml:space="preserve">rerun_state_raw.json</w:t>
+      </w:r>
+      <w:r>
+        <w:rPr>
+          <w:rFonts w:ascii="Georgia" w:cs="Georgia" w:eastAsia="Georgia" w:hAnsi="Georgia"/>
+          <w:sz w:val="21"/>
+          <w:szCs w:val="21"/>
+        </w:rPr>
+        <w:t xml:space="preserve">, the raw tarball and walk records for the 500 re-measured control packages; and </w:t>
+      </w:r>
+      <w:r>
+        <w:rPr>
+          <w:rFonts w:ascii="Consolas" w:cs="Consolas" w:eastAsia="Consolas" w:hAnsi="Consolas"/>
+          <w:sz w:val="19"/>
+          <w:szCs w:val="19"/>
+        </w:rPr>
+        <w:t xml:space="preserve">rows_1_4_rematched.json</w:t>
+      </w:r>
+      <w:r>
+        <w:rPr>
+          <w:rFonts w:ascii="Georgia" w:cs="Georgia" w:eastAsia="Georgia" w:hAnsi="Georgia"/>
+          <w:sz w:val="21"/>
+          <w:szCs w:val="21"/>
+        </w:rPr>
+        <w:t xml:space="preserve">, the summary built from them, alongside </w:t>
+      </w:r>
+      <w:r>
+        <w:rPr>
+          <w:rFonts w:ascii="Consolas" w:cs="Consolas" w:eastAsia="Consolas" w:hAnsi="Consolas"/>
+          <w:sz w:val="19"/>
+          <w:szCs w:val="19"/>
+        </w:rPr>
+        <w:t xml:space="preserve">rerun_rows_1_4.py</w:t>
+      </w:r>
+      <w:r>
+        <w:rPr>
+          <w:rFonts w:ascii="Georgia" w:cs="Georgia" w:eastAsia="Georgia" w:hAnsi="Georgia"/>
+          <w:sz w:val="21"/>
+          <w:szCs w:val="21"/>
+        </w:rPr>
+        <w:t xml:space="preserve"> which produced both.</w:t>
+      </w:r>
+    </w:p>
+    <w:p>
+      <w:pPr>
+        <w:spacing w:after="160"/>
+        <w:jc w:val="left"/>
+      </w:pPr>
+      <w:r>
+        <w:rPr>
+          <w:rFonts w:ascii="Georgia" w:cs="Georgia" w:eastAsia="Georgia" w:hAnsi="Georgia"/>
+          <w:b/>
+          <w:bCs/>
+          <w:sz w:val="21"/>
+          <w:szCs w:val="21"/>
+        </w:rPr>
+        <w:t xml:space="preserve">Licensing.</w:t>
+      </w:r>
+      <w:r>
+        <w:rPr>
+          <w:rFonts w:ascii="Georgia" w:cs="Georgia" w:eastAsia="Georgia" w:hAnsi="Georgia"/>
+          <w:sz w:val="21"/>
+          <w:szCs w:val="21"/>
+        </w:rPr>
+        <w:t xml:space="preserve"> Code is released under Apache-2.0. Data is released under CC-BY-4.0. The datasets consist of factual metadata retrieved from public registry APIs, together with derived statistics; no third-party package source is redistributed.</w:t>
+      </w:r>
+    </w:p>
+    <w:p>
+      <w:pPr>
+        <w:spacing w:after="160"/>
+        <w:jc w:val="left"/>
+      </w:pPr>
+      <w:r>
+        <w:rPr>
+          <w:rFonts w:ascii="Georgia" w:cs="Georgia" w:eastAsia="Georgia" w:hAnsi="Georgia"/>
+          <w:b/>
+          <w:bCs/>
+          <w:sz w:val="21"/>
+          <w:szCs w:val="21"/>
+        </w:rPr>
+        <w:t xml:space="preserve">Provenance.</w:t>
+      </w:r>
+      <w:r>
+        <w:rPr>
+          <w:rFonts w:ascii="Georgia" w:cs="Georgia" w:eastAsia="Georgia" w:hAnsi="Georgia"/>
+          <w:sz w:val="21"/>
+          <w:szCs w:val="21"/>
+        </w:rPr>
+        <w:t xml:space="preserve"> The resolver uses only the public npm and PyPI registry APIs and the public Docker Hub repository API. Package trees were resolved with npm semver range semantics rather than by taking </w:t>
+      </w:r>
+      <w:r>
+        <w:rPr>
+          <w:rFonts w:ascii="Consolas" w:cs="Consolas" w:eastAsia="Consolas" w:hAnsi="Consolas"/>
+          <w:sz w:val="19"/>
+          <w:szCs w:val="19"/>
+        </w:rPr>
+        <w:t xml:space="preserve">latest</w:t>
+      </w:r>
+      <w:r>
+        <w:rPr>
+          <w:rFonts w:ascii="Georgia" w:cs="Georgia" w:eastAsia="Georgia" w:hAnsi="Georgia"/>
+          <w:sz w:val="21"/>
+          <w:szCs w:val="21"/>
+        </w:rPr>
+        <w:t xml:space="preserve">, which is why the round-one dataset is superseded. License detection uses the SPDX License List, 739 identifiers at time of measurement. Docker pull counts were taken one repository at a time from the 328-entry </w:t>
+      </w:r>
+      <w:r>
+        <w:rPr>
+          <w:rFonts w:ascii="Consolas" w:cs="Consolas" w:eastAsia="Consolas" w:hAnsi="Consolas"/>
+          <w:sz w:val="19"/>
+          <w:szCs w:val="19"/>
+        </w:rPr>
+        <w:t xml:space="preserve">docker/mcp-registry</w:t>
+      </w:r>
+      <w:r>
+        <w:rPr>
+          <w:rFonts w:ascii="Georgia" w:cs="Georgia" w:eastAsia="Georgia" w:hAnsi="Georgia"/>
+          <w:sz w:val="21"/>
+          <w:szCs w:val="21"/>
+        </w:rPr>
+        <w:t xml:space="preserve"> catalog, because the namespace listing endpoint silently ignores its ordering parameter (Section 6).</w:t>
+      </w:r>
+    </w:p>
+    <w:p>
+      <w:pPr>
+        <w:spacing w:after="160"/>
+        <w:jc w:val="left"/>
+      </w:pPr>
+      <w:r>
+        <w:rPr>
+          <w:rFonts w:ascii="Georgia" w:cs="Georgia" w:eastAsia="Georgia" w:hAnsi="Georgia"/>
+          <w:b/>
+          <w:bCs/>
+          <w:sz w:val="21"/>
+          <w:szCs w:val="21"/>
+        </w:rPr>
+        <w:t xml:space="preserve">Reproduction notes.</w:t>
+      </w:r>
+      <w:r>
+        <w:rPr>
+          <w:rFonts w:ascii="Georgia" w:cs="Georgia" w:eastAsia="Georgia" w:hAnsi="Georgia"/>
+          <w:sz w:val="21"/>
+          <w:szCs w:val="21"/>
+        </w:rPr>
+        <w:t xml:space="preserve"> Three things will otherwise reproduce our mistakes rather than our results.</w:t>
       </w:r>
     </w:p>
     <w:p>
@@ -7758,6 +7896,70 @@
           <w:sz w:val="21"/>
           <w:szCs w:val="21"/>
         </w:rPr>
+        <w:t xml:space="preserve">1.  </w:t>
+      </w:r>
+      <w:r>
+        <w:rPr>
+          <w:rFonts w:ascii="Georgia" w:cs="Georgia" w:eastAsia="Georgia" w:hAnsi="Georgia"/>
+          <w:sz w:val="21"/>
+          <w:szCs w:val="21"/>
+        </w:rPr>
+        <w:t xml:space="preserve">Do not build a sampling frame from the npm search API without matching coverage fractions across arms. Section 6 gives the false positive this produces, z = 7.32 for an effect that does not exist.</w:t>
+      </w:r>
+    </w:p>
+    <w:p>
+      <w:pPr>
+        <w:spacing w:after="100"/>
+        <w:ind w:left="504" w:hanging="360"/>
+      </w:pPr>
+      <w:r>
+        <w:rPr>
+          <w:rFonts w:ascii="Georgia" w:cs="Georgia" w:eastAsia="Georgia" w:hAnsi="Georgia"/>
+          <w:b/>
+          <w:bCs/>
+          <w:sz w:val="21"/>
+          <w:szCs w:val="21"/>
+        </w:rPr>
+        <w:t xml:space="preserve">2.  </w:t>
+      </w:r>
+      <w:r>
+        <w:rPr>
+          <w:rFonts w:ascii="Georgia" w:cs="Georgia" w:eastAsia="Georgia" w:hAnsi="Georgia"/>
+          <w:sz w:val="21"/>
+          <w:szCs w:val="21"/>
+        </w:rPr>
+        <w:t xml:space="preserve">Verify that an ordering parameter took effect before building anything on the result. Docker Hub accepts </w:t>
+      </w:r>
+      <w:r>
+        <w:rPr>
+          <w:rFonts w:ascii="Consolas" w:cs="Consolas" w:eastAsia="Consolas" w:hAnsi="Consolas"/>
+          <w:sz w:val="19"/>
+          <w:szCs w:val="19"/>
+        </w:rPr>
+        <w:t xml:space="preserve">ordering=-pull_count</w:t>
+      </w:r>
+      <w:r>
+        <w:rPr>
+          <w:rFonts w:ascii="Georgia" w:cs="Georgia" w:eastAsia="Georgia" w:hAnsi="Georgia"/>
+          <w:sz w:val="21"/>
+          <w:szCs w:val="21"/>
+        </w:rPr>
+        <w:t xml:space="preserve"> and ignores it.</w:t>
+      </w:r>
+    </w:p>
+    <w:p>
+      <w:pPr>
+        <w:spacing w:after="100"/>
+        <w:ind w:left="504" w:hanging="360"/>
+      </w:pPr>
+      <w:r>
+        <w:rPr>
+          <w:rFonts w:ascii="Georgia" w:cs="Georgia" w:eastAsia="Georgia" w:hAnsi="Georgia"/>
+          <w:b/>
+          <w:bCs/>
+          <w:sz w:val="21"/>
+          <w:szCs w:val="21"/>
+        </w:rPr>
         <w:t xml:space="preserve">3.  </w:t>
       </w:r>
       <w:r>
@@ -7791,6 +7993,821 @@
           <w:szCs w:val="21"/>
         </w:rPr>
         <w:t xml:space="preserve"> That is the one instruction in this paper we would keep if we could keep only one.</w:t>
+      </w:r>
+    </w:p>
+    <w:p>
+      <w:pPr>
+        <w:pBdr>
+          <w:bottom w:val="single" w:color="CCCCCC" w:sz="6" w:space="8"/>
+        </w:pBdr>
+        <w:spacing w:after="200" w:before="120"/>
+      </w:pPr>
+    </w:p>
+    <w:p>
+      <w:pPr>
+        <w:pStyle w:val="Heading1"/>
+        <w:spacing w:after="140" w:before="320"/>
+      </w:pPr>
+      <w:r>
+        <w:rPr>
+          <w:rFonts w:ascii="Georgia" w:cs="Georgia" w:eastAsia="Georgia" w:hAnsi="Georgia"/>
+          <w:b/>
+          <w:bCs/>
+          <w:sz w:val="26"/>
+          <w:szCs w:val="26"/>
+        </w:rPr>
+        <w:t xml:space="preserve">11. Changes since version 1.0.0</w:t>
+      </w:r>
+    </w:p>
+    <w:p>
+      <w:pPr>
+        <w:spacing w:after="160"/>
+        <w:jc w:val="left"/>
+      </w:pPr>
+      <w:r>
+        <w:rPr>
+          <w:rFonts w:ascii="Georgia" w:cs="Georgia" w:eastAsia="Georgia" w:hAnsi="Georgia"/>
+          <w:sz w:val="21"/>
+          <w:szCs w:val="21"/>
+        </w:rPr>
+        <w:t xml:space="preserve">Version 1.0.0 was published on 7 September 2026 and archived under DOI 10.5281/zenodo.22641813. An independent check of the paper's numbers against the released data, run the same day, found the following. Every change is listed, including the ones that weaken the paper.</w:t>
+      </w:r>
+    </w:p>
+    <w:p>
+      <w:pPr>
+        <w:spacing w:after="160"/>
+        <w:jc w:val="left"/>
+      </w:pPr>
+      <w:r>
+        <w:rPr>
+          <w:rFonts w:ascii="Georgia" w:cs="Georgia" w:eastAsia="Georgia" w:hAnsi="Georgia"/>
+          <w:b/>
+          <w:bCs/>
+          <w:sz w:val="21"/>
+          <w:szCs w:val="21"/>
+        </w:rPr>
+        <w:t xml:space="preserve">Rows 1 to 4 were measured against an invalid control and have been re-measured.</w:t>
+      </w:r>
+      <w:r>
+        <w:rPr>
+          <w:rFonts w:ascii="Georgia" w:cs="Georgia" w:eastAsia="Georgia" w:hAnsi="Georgia"/>
+          <w:sz w:val="21"/>
+          <w:szCs w:val="21"/>
+        </w:rPr>
+        <w:t xml:space="preserve"> Section 2.1 described the table as coverage-matched. Only rows 5 to 7 were. Rows 1 to 4 used the </w:t>
+      </w:r>
+      <w:r>
+        <w:rPr>
+          <w:rFonts w:ascii="Consolas" w:cs="Consolas" w:eastAsia="Consolas" w:hAnsi="Consolas"/>
+          <w:sz w:val="19"/>
+          <w:szCs w:val="19"/>
+        </w:rPr>
+        <w:t xml:space="preserve">keywords:cli</w:t>
+      </w:r>
+      <w:r>
+        <w:rPr>
+          <w:rFonts w:ascii="Georgia" w:cs="Georgia" w:eastAsia="Georgia" w:hAnsi="Georgia"/>
+          <w:sz w:val="21"/>
+          <w:szCs w:val="21"/>
+        </w:rPr>
+        <w:t xml:space="preserve"> plus </w:t>
+      </w:r>
+      <w:r>
+        <w:rPr>
+          <w:rFonts w:ascii="Consolas" w:cs="Consolas" w:eastAsia="Consolas" w:hAnsi="Consolas"/>
+          <w:sz w:val="19"/>
+          <w:szCs w:val="19"/>
+        </w:rPr>
+        <w:t xml:space="preserve">keywords:server</w:t>
+      </w:r>
+      <w:r>
+        <w:rPr>
+          <w:rFonts w:ascii="Georgia" w:cs="Georgia" w:eastAsia="Georgia" w:hAnsi="Georgia"/>
+          <w:sz w:val="21"/>
+          <w:szCs w:val="21"/>
+        </w:rPr>
+        <w:t xml:space="preserve"> frame that Section 6 shows to be a 2.4% top-slice. Re-measured against the coverage-matched frames:</w:t>
+      </w:r>
+    </w:p>
+    <w:tbl>
+      <w:tblPr>
+        <w:tblW w:type="dxa" w:w="9360"/>
+        <w:tblBorders>
+          <w:top w:val="single" w:color="auto" w:sz="4"/>
+          <w:left w:val="single" w:color="auto" w:sz="4"/>
+          <w:bottom w:val="single" w:color="auto" w:sz="4"/>
+          <w:right w:val="single" w:color="auto" w:sz="4"/>
+          <w:insideH w:val="single" w:color="auto" w:sz="4"/>
+          <w:insideV w:val="single" w:color="auto" w:sz="4"/>
+        </w:tblBorders>
+      </w:tblPr>
+      <w:tblGrid>
+        <w:gridCol w:w="3120"/>
+        <w:gridCol w:w="3120"/>
+        <w:gridCol w:w="3120"/>
+      </w:tblGrid>
+      <w:tr>
+        <w:trPr>
+          <w:tblHeader/>
+        </w:trPr>
+        <w:tc>
+          <w:tcPr>
+            <w:tcW w:type="dxa" w:w="3120"/>
+            <w:shd w:fill="EFEFEF" w:val="clear"/>
+            <w:tcMar>
+              <w:top w:type="dxa" w:w="60"/>
+              <w:left w:type="dxa" w:w="90"/>
+              <w:bottom w:type="dxa" w:w="60"/>
+              <w:right w:type="dxa" w:w="90"/>
+            </w:tcMar>
+          </w:tcPr>
+          <w:p>
+            <w:pPr>
+              <w:spacing w:after="0"/>
+            </w:pPr>
+            <w:r>
+              <w:rPr>
+                <w:rFonts w:ascii="Georgia" w:cs="Georgia" w:eastAsia="Georgia" w:hAnsi="Georgia"/>
+                <w:b/>
+                <w:bCs/>
+                <w:sz w:val="21"/>
+                <w:szCs w:val="21"/>
+              </w:rPr>
+              <w:t xml:space="preserve">Row</w:t>
+            </w:r>
+          </w:p>
+        </w:tc>
+        <w:tc>
+          <w:tcPr>
+            <w:tcW w:type="dxa" w:w="3120"/>
+            <w:shd w:fill="EFEFEF" w:val="clear"/>
+            <w:tcMar>
+              <w:top w:type="dxa" w:w="60"/>
+              <w:left w:type="dxa" w:w="90"/>
+              <w:bottom w:type="dxa" w:w="60"/>
+              <w:right w:type="dxa" w:w="90"/>
+            </w:tcMar>
+          </w:tcPr>
+          <w:p>
+            <w:pPr>
+              <w:spacing w:after="0"/>
+            </w:pPr>
+            <w:r>
+              <w:rPr>
+                <w:rFonts w:ascii="Georgia" w:cs="Georgia" w:eastAsia="Georgia" w:hAnsi="Georgia"/>
+                <w:b/>
+                <w:bCs/>
+                <w:sz w:val="21"/>
+                <w:szCs w:val="21"/>
+              </w:rPr>
+              <w:t xml:space="preserve">1.0.0</w:t>
+            </w:r>
+          </w:p>
+        </w:tc>
+        <w:tc>
+          <w:tcPr>
+            <w:tcW w:type="dxa" w:w="3120"/>
+            <w:shd w:fill="EFEFEF" w:val="clear"/>
+            <w:tcMar>
+              <w:top w:type="dxa" w:w="60"/>
+              <w:left w:type="dxa" w:w="90"/>
+              <w:bottom w:type="dxa" w:w="60"/>
+              <w:right w:type="dxa" w:w="90"/>
+            </w:tcMar>
+          </w:tcPr>
+          <w:p>
+            <w:pPr>
+              <w:spacing w:after="0"/>
+            </w:pPr>
+            <w:r>
+              <w:rPr>
+                <w:rFonts w:ascii="Georgia" w:cs="Georgia" w:eastAsia="Georgia" w:hAnsi="Georgia"/>
+                <w:b/>
+                <w:bCs/>
+                <w:sz w:val="21"/>
+                <w:szCs w:val="21"/>
+              </w:rPr>
+              <w:t xml:space="preserve">1.0.1</w:t>
+            </w:r>
+          </w:p>
+        </w:tc>
+      </w:tr>
+      <w:tr>
+        <w:trPr>
+          <w:tblHeader w:val="false"/>
+        </w:trPr>
+        <w:tc>
+          <w:tcPr>
+            <w:tcW w:type="dxa" w:w="3120"/>
+            <w:tcMar>
+              <w:top w:type="dxa" w:w="60"/>
+              <w:left w:type="dxa" w:w="90"/>
+              <w:bottom w:type="dxa" w:w="60"/>
+              <w:right w:type="dxa" w:w="90"/>
+            </w:tcMar>
+          </w:tcPr>
+          <w:p>
+            <w:pPr>
+              <w:spacing w:after="0"/>
+            </w:pPr>
+            <w:r>
+              <w:rPr>
+                <w:rFonts w:ascii="Georgia" w:cs="Georgia" w:eastAsia="Georgia" w:hAnsi="Georgia"/>
+                <w:sz w:val="21"/>
+                <w:szCs w:val="21"/>
+              </w:rPr>
+              <w:t xml:space="preserve">1 Ships no license file</w:t>
+            </w:r>
+          </w:p>
+        </w:tc>
+        <w:tc>
+          <w:tcPr>
+            <w:tcW w:type="dxa" w:w="3120"/>
+            <w:tcMar>
+              <w:top w:type="dxa" w:w="60"/>
+              <w:left w:type="dxa" w:w="90"/>
+              <w:bottom w:type="dxa" w:w="60"/>
+              <w:right w:type="dxa" w:w="90"/>
+            </w:tcMar>
+          </w:tcPr>
+          <w:p>
+            <w:pPr>
+              <w:spacing w:after="0"/>
+            </w:pPr>
+            <w:r>
+              <w:rPr>
+                <w:rFonts w:ascii="Georgia" w:cs="Georgia" w:eastAsia="Georgia" w:hAnsi="Georgia"/>
+                <w:sz w:val="21"/>
+                <w:szCs w:val="21"/>
+              </w:rPr>
+              <w:t xml:space="preserve">null, z = −1.09</w:t>
+            </w:r>
+          </w:p>
+        </w:tc>
+        <w:tc>
+          <w:tcPr>
+            <w:tcW w:type="dxa" w:w="3120"/>
+            <w:tcMar>
+              <w:top w:type="dxa" w:w="60"/>
+              <w:left w:type="dxa" w:w="90"/>
+              <w:bottom w:type="dxa" w:w="60"/>
+              <w:right w:type="dxa" w:w="90"/>
+            </w:tcMar>
+          </w:tcPr>
+          <w:p>
+            <w:pPr>
+              <w:spacing w:after="0"/>
+            </w:pPr>
+            <w:r>
+              <w:rPr>
+                <w:rFonts w:ascii="Georgia" w:cs="Georgia" w:eastAsia="Georgia" w:hAnsi="Georgia"/>
+                <w:sz w:val="21"/>
+                <w:szCs w:val="21"/>
+              </w:rPr>
+              <w:t xml:space="preserve">MCP lower, z = −3.92 and −7.32</w:t>
+            </w:r>
+          </w:p>
+        </w:tc>
+      </w:tr>
+      <w:tr>
+        <w:trPr>
+          <w:tblHeader w:val="false"/>
+        </w:trPr>
+        <w:tc>
+          <w:tcPr>
+            <w:tcW w:type="dxa" w:w="3120"/>
+            <w:tcMar>
+              <w:top w:type="dxa" w:w="60"/>
+              <w:left w:type="dxa" w:w="90"/>
+              <w:bottom w:type="dxa" w:w="60"/>
+              <w:right w:type="dxa" w:w="90"/>
+            </w:tcMar>
+          </w:tcPr>
+          <w:p>
+            <w:pPr>
+              <w:spacing w:after="0"/>
+            </w:pPr>
+            <w:r>
+              <w:rPr>
+                <w:rFonts w:ascii="Georgia" w:cs="Georgia" w:eastAsia="Georgia" w:hAnsi="Georgia"/>
+                <w:sz w:val="21"/>
+                <w:szCs w:val="21"/>
+              </w:rPr>
+              <w:t xml:space="preserve">2 Declares, ships no text</w:t>
+            </w:r>
+          </w:p>
+        </w:tc>
+        <w:tc>
+          <w:tcPr>
+            <w:tcW w:type="dxa" w:w="3120"/>
+            <w:tcMar>
+              <w:top w:type="dxa" w:w="60"/>
+              <w:left w:type="dxa" w:w="90"/>
+              <w:bottom w:type="dxa" w:w="60"/>
+              <w:right w:type="dxa" w:w="90"/>
+            </w:tcMar>
+          </w:tcPr>
+          <w:p>
+            <w:pPr>
+              <w:spacing w:after="0"/>
+            </w:pPr>
+            <w:r>
+              <w:rPr>
+                <w:rFonts w:ascii="Georgia" w:cs="Georgia" w:eastAsia="Georgia" w:hAnsi="Georgia"/>
+                <w:sz w:val="21"/>
+                <w:szCs w:val="21"/>
+              </w:rPr>
+              <w:t xml:space="preserve">null, z = −1.05</w:t>
+            </w:r>
+          </w:p>
+        </w:tc>
+        <w:tc>
+          <w:tcPr>
+            <w:tcW w:type="dxa" w:w="3120"/>
+            <w:tcMar>
+              <w:top w:type="dxa" w:w="60"/>
+              <w:left w:type="dxa" w:w="90"/>
+              <w:bottom w:type="dxa" w:w="60"/>
+              <w:right w:type="dxa" w:w="90"/>
+            </w:tcMar>
+          </w:tcPr>
+          <w:p>
+            <w:pPr>
+              <w:spacing w:after="0"/>
+            </w:pPr>
+            <w:r>
+              <w:rPr>
+                <w:rFonts w:ascii="Georgia" w:cs="Georgia" w:eastAsia="Georgia" w:hAnsi="Georgia"/>
+                <w:sz w:val="21"/>
+                <w:szCs w:val="21"/>
+              </w:rPr>
+              <w:t xml:space="preserve">MCP lower, z = −4.12 and −7.43</w:t>
+            </w:r>
+          </w:p>
+        </w:tc>
+      </w:tr>
+      <w:tr>
+        <w:trPr>
+          <w:tblHeader w:val="false"/>
+        </w:trPr>
+        <w:tc>
+          <w:tcPr>
+            <w:tcW w:type="dxa" w:w="3120"/>
+            <w:tcMar>
+              <w:top w:type="dxa" w:w="60"/>
+              <w:left w:type="dxa" w:w="90"/>
+              <w:bottom w:type="dxa" w:w="60"/>
+              <w:right w:type="dxa" w:w="90"/>
+            </w:tcMar>
+          </w:tcPr>
+          <w:p>
+            <w:pPr>
+              <w:spacing w:after="0"/>
+            </w:pPr>
+            <w:r>
+              <w:rPr>
+                <w:rFonts w:ascii="Georgia" w:cs="Georgia" w:eastAsia="Georgia" w:hAnsi="Georgia"/>
+                <w:sz w:val="21"/>
+                <w:szCs w:val="21"/>
+              </w:rPr>
+              <w:t xml:space="preserve">3 Deprecated in tree</w:t>
+            </w:r>
+          </w:p>
+        </w:tc>
+        <w:tc>
+          <w:tcPr>
+            <w:tcW w:type="dxa" w:w="3120"/>
+            <w:tcMar>
+              <w:top w:type="dxa" w:w="60"/>
+              <w:left w:type="dxa" w:w="90"/>
+              <w:bottom w:type="dxa" w:w="60"/>
+              <w:right w:type="dxa" w:w="90"/>
+            </w:tcMar>
+          </w:tcPr>
+          <w:p>
+            <w:pPr>
+              <w:spacing w:after="0"/>
+            </w:pPr>
+            <w:r>
+              <w:rPr>
+                <w:rFonts w:ascii="Georgia" w:cs="Georgia" w:eastAsia="Georgia" w:hAnsi="Georgia"/>
+                <w:sz w:val="21"/>
+                <w:szCs w:val="21"/>
+              </w:rPr>
+              <w:t xml:space="preserve">null, z = −1.57</w:t>
+            </w:r>
+          </w:p>
+        </w:tc>
+        <w:tc>
+          <w:tcPr>
+            <w:tcW w:type="dxa" w:w="3120"/>
+            <w:tcMar>
+              <w:top w:type="dxa" w:w="60"/>
+              <w:left w:type="dxa" w:w="90"/>
+              <w:bottom w:type="dxa" w:w="60"/>
+              <w:right w:type="dxa" w:w="90"/>
+            </w:tcMar>
+          </w:tcPr>
+          <w:p>
+            <w:pPr>
+              <w:spacing w:after="0"/>
+            </w:pPr>
+            <w:r>
+              <w:rPr>
+                <w:rFonts w:ascii="Georgia" w:cs="Georgia" w:eastAsia="Georgia" w:hAnsi="Georgia"/>
+                <w:sz w:val="21"/>
+                <w:szCs w:val="21"/>
+              </w:rPr>
+              <w:t xml:space="preserve">null and MCP lower, z = −0.92 and −2.29</w:t>
+            </w:r>
+          </w:p>
+        </w:tc>
+      </w:tr>
+      <w:tr>
+        <w:trPr>
+          <w:tblHeader w:val="false"/>
+        </w:trPr>
+        <w:tc>
+          <w:tcPr>
+            <w:tcW w:type="dxa" w:w="3120"/>
+            <w:tcMar>
+              <w:top w:type="dxa" w:w="60"/>
+              <w:left w:type="dxa" w:w="90"/>
+              <w:bottom w:type="dxa" w:w="60"/>
+              <w:right w:type="dxa" w:w="90"/>
+            </w:tcMar>
+          </w:tcPr>
+          <w:p>
+            <w:pPr>
+              <w:spacing w:after="0"/>
+            </w:pPr>
+            <w:r>
+              <w:rPr>
+                <w:rFonts w:ascii="Georgia" w:cs="Georgia" w:eastAsia="Georgia" w:hAnsi="Georgia"/>
+                <w:sz w:val="21"/>
+                <w:szCs w:val="21"/>
+              </w:rPr>
+              <w:t xml:space="preserve">4 Released in last 30 days</w:t>
+            </w:r>
+          </w:p>
+        </w:tc>
+        <w:tc>
+          <w:tcPr>
+            <w:tcW w:type="dxa" w:w="3120"/>
+            <w:tcMar>
+              <w:top w:type="dxa" w:w="60"/>
+              <w:left w:type="dxa" w:w="90"/>
+              <w:bottom w:type="dxa" w:w="60"/>
+              <w:right w:type="dxa" w:w="90"/>
+            </w:tcMar>
+          </w:tcPr>
+          <w:p>
+            <w:pPr>
+              <w:spacing w:after="0"/>
+            </w:pPr>
+            <w:r>
+              <w:rPr>
+                <w:rFonts w:ascii="Georgia" w:cs="Georgia" w:eastAsia="Georgia" w:hAnsi="Georgia"/>
+                <w:b/>
+                <w:bCs/>
+                <w:sz w:val="21"/>
+                <w:szCs w:val="21"/>
+              </w:rPr>
+              <w:t xml:space="preserve">MCP lower</w:t>
+            </w:r>
+            <w:r>
+              <w:rPr>
+                <w:rFonts w:ascii="Georgia" w:cs="Georgia" w:eastAsia="Georgia" w:hAnsi="Georgia"/>
+                <w:sz w:val="21"/>
+                <w:szCs w:val="21"/>
+              </w:rPr>
+              <w:t xml:space="preserve">, z = −4.15</w:t>
+            </w:r>
+          </w:p>
+        </w:tc>
+        <w:tc>
+          <w:tcPr>
+            <w:tcW w:type="dxa" w:w="3120"/>
+            <w:tcMar>
+              <w:top w:type="dxa" w:w="60"/>
+              <w:left w:type="dxa" w:w="90"/>
+              <w:bottom w:type="dxa" w:w="60"/>
+              <w:right w:type="dxa" w:w="90"/>
+            </w:tcMar>
+          </w:tcPr>
+          <w:p>
+            <w:pPr>
+              <w:spacing w:after="0"/>
+            </w:pPr>
+            <w:r>
+              <w:rPr>
+                <w:rFonts w:ascii="Georgia" w:cs="Georgia" w:eastAsia="Georgia" w:hAnsi="Georgia"/>
+                <w:b/>
+                <w:bCs/>
+                <w:sz w:val="21"/>
+                <w:szCs w:val="21"/>
+              </w:rPr>
+              <w:t xml:space="preserve">MCP higher</w:t>
+            </w:r>
+            <w:r>
+              <w:rPr>
+                <w:rFonts w:ascii="Georgia" w:cs="Georgia" w:eastAsia="Georgia" w:hAnsi="Georgia"/>
+                <w:sz w:val="21"/>
+                <w:szCs w:val="21"/>
+              </w:rPr>
+              <w:t xml:space="preserve">, z = +5.06 and +3.52</w:t>
+            </w:r>
+          </w:p>
+        </w:tc>
+      </w:tr>
+    </w:tbl>
+    <w:p>
+      <w:pPr>
+        <w:spacing w:after="200"/>
+      </w:pPr>
+    </w:p>
+    <w:p>
+      <w:pPr>
+        <w:spacing w:after="160"/>
+        <w:jc w:val="left"/>
+      </w:pPr>
+      <w:r>
+        <w:rPr>
+          <w:rFonts w:ascii="Georgia" w:cs="Georgia" w:eastAsia="Georgia" w:hAnsi="Georgia"/>
+          <w:sz w:val="21"/>
+          <w:szCs w:val="21"/>
+        </w:rPr>
+        <w:t xml:space="preserve">Row 4 changed sign. The 1.0.0 claim that MCP servers publish less often than comparable npm applications was an artifact of the invalid frame and is withdrawn.</w:t>
+      </w:r>
+    </w:p>
+    <w:p>
+      <w:pPr>
+        <w:spacing w:after="160"/>
+        <w:jc w:val="left"/>
+      </w:pPr>
+      <w:r>
+        <w:rPr>
+          <w:rFonts w:ascii="Georgia" w:cs="Georgia" w:eastAsia="Georgia" w:hAnsi="Georgia"/>
+          <w:b/>
+          <w:bCs/>
+          <w:sz w:val="21"/>
+          <w:szCs w:val="21"/>
+        </w:rPr>
+        <w:t xml:space="preserve">The row 4 control proportion in 1.0.0 was also wrong.</w:t>
+      </w:r>
+      <w:r>
+        <w:rPr>
+          <w:rFonts w:ascii="Georgia" w:cs="Georgia" w:eastAsia="Georgia" w:hAnsi="Georgia"/>
+          <w:sz w:val="21"/>
+          <w:szCs w:val="21"/>
+        </w:rPr>
+        <w:t xml:space="preserve"> It was reported as 111 of 250. The per-package records in </w:t>
+      </w:r>
+      <w:r>
+        <w:rPr>
+          <w:rFonts w:ascii="Consolas" w:cs="Consolas" w:eastAsia="Consolas" w:hAnsi="Consolas"/>
+          <w:sz w:val="19"/>
+          <w:szCs w:val="19"/>
+        </w:rPr>
+        <w:t xml:space="preserve">mcp-confound-tests.json</w:t>
+      </w:r>
+      <w:r>
+        <w:rPr>
+          <w:rFonts w:ascii="Georgia" w:cs="Georgia" w:eastAsia="Georgia" w:hAnsi="Georgia"/>
+          <w:sz w:val="21"/>
+          <w:szCs w:val="21"/>
+        </w:rPr>
+        <w:t xml:space="preserve"> give 104 of 250 and z = −3.44 rather than −4.15. The MCP numerator, 114 of 400, reproduces exactly. Note that the summary block in </w:t>
+      </w:r>
+      <w:r>
+        <w:rPr>
+          <w:rFonts w:ascii="Consolas" w:cs="Consolas" w:eastAsia="Consolas" w:hAnsi="Consolas"/>
+          <w:sz w:val="19"/>
+          <w:szCs w:val="19"/>
+        </w:rPr>
+        <w:t xml:space="preserve">mcp-controls-data.json</w:t>
+      </w:r>
+      <w:r>
+        <w:rPr>
+          <w:rFonts w:ascii="Georgia" w:cs="Georgia" w:eastAsia="Georgia" w:hAnsi="Georgia"/>
+          <w:sz w:val="21"/>
+          <w:szCs w:val="21"/>
+        </w:rPr>
+        <w:t xml:space="preserve"> still asserts 111; it is shipped uncorrected so that the discrepancy is visible rather than tidied away.</w:t>
+      </w:r>
+    </w:p>
+    <w:p>
+      <w:pPr>
+        <w:spacing w:after="160"/>
+        <w:jc w:val="left"/>
+      </w:pPr>
+      <w:r>
+        <w:rPr>
+          <w:rFonts w:ascii="Georgia" w:cs="Georgia" w:eastAsia="Georgia" w:hAnsi="Georgia"/>
+          <w:b/>
+          <w:bCs/>
+          <w:sz w:val="21"/>
+          <w:szCs w:val="21"/>
+        </w:rPr>
+        <w:t xml:space="preserve">Row 7 was printed with the z column blank.</w:t>
+      </w:r>
+      <w:r>
+        <w:rPr>
+          <w:rFonts w:ascii="Georgia" w:cs="Georgia" w:eastAsia="Georgia" w:hAnsi="Georgia"/>
+          <w:sz w:val="21"/>
+          <w:szCs w:val="21"/>
+        </w:rPr>
+        <w:t xml:space="preserve"> The underlying measurement records z = +8.01 against eslint-plugin and z = −6.83 against langchain. Both are now shown. The row is still reported as a null because MCP sits between two comparable ecosystems, but readers should see the magnitudes.</w:t>
+      </w:r>
+    </w:p>
+    <w:p>
+      <w:pPr>
+        <w:spacing w:after="160"/>
+        <w:jc w:val="left"/>
+      </w:pPr>
+      <w:r>
+        <w:rPr>
+          <w:rFonts w:ascii="Georgia" w:cs="Georgia" w:eastAsia="Georgia" w:hAnsi="Georgia"/>
+          <w:b/>
+          <w:bCs/>
+          <w:sz w:val="21"/>
+          <w:szCs w:val="21"/>
+        </w:rPr>
+        <w:t xml:space="preserve">The headline was overstated.</w:t>
+      </w:r>
+      <w:r>
+        <w:rPr>
+          <w:rFonts w:ascii="Georgia" w:cs="Georgia" w:eastAsia="Georgia" w:hAnsi="Georgia"/>
+          <w:sz w:val="21"/>
+          <w:szCs w:val="21"/>
+        </w:rPr>
+        <w:t xml:space="preserve"> 1.0.0 was titled "Eight Null Results" and claimed seven nulls. Under corrected controls the count is two clean nulls, one row that is null against one control and favourable against the other, one row that sits between two ecosystems, two rows where MCP is lower, and one where it is higher. The conclusion that no dimension shows elevated risk is unchanged and is now better supported. The word "null" is no longer accurate and has been removed from the title.</w:t>
+      </w:r>
+    </w:p>
+    <w:p>
+      <w:pPr>
+        <w:spacing w:after="160"/>
+        <w:jc w:val="left"/>
+      </w:pPr>
+      <w:r>
+        <w:rPr>
+          <w:rFonts w:ascii="Georgia" w:cs="Georgia" w:eastAsia="Georgia" w:hAnsi="Georgia"/>
+          <w:b/>
+          <w:bCs/>
+          <w:sz w:val="21"/>
+          <w:szCs w:val="21"/>
+        </w:rPr>
+        <w:t xml:space="preserve">A limitation was understated.</w:t>
+      </w:r>
+      <w:r>
+        <w:rPr>
+          <w:rFonts w:ascii="Georgia" w:cs="Georgia" w:eastAsia="Georgia" w:hAnsi="Georgia"/>
+          <w:sz w:val="21"/>
+          <w:szCs w:val="21"/>
+        </w:rPr>
+        <w:t xml:space="preserve"> Our MCP frame covers 64% against controls at 74% and 100%, so the residual mismatch runs in MCP's favour. Rows 1, 2 and 4 are now reported as bounds. Separately, no frame is matched on both coverage and tree shape, which affects row 3.</w:t>
+      </w:r>
+    </w:p>
+    <w:p>
+      <w:pPr>
+        <w:spacing w:after="160"/>
+        <w:jc w:val="left"/>
+      </w:pPr>
+      <w:r>
+        <w:rPr>
+          <w:rFonts w:ascii="Georgia" w:cs="Georgia" w:eastAsia="Georgia" w:hAnsi="Georgia"/>
+          <w:b/>
+          <w:bCs/>
+          <w:sz w:val="21"/>
+          <w:szCs w:val="21"/>
+        </w:rPr>
+        <w:t xml:space="preserve">Section 3 was not reproducible.</w:t>
+      </w:r>
+      <w:r>
+        <w:rPr>
+          <w:rFonts w:ascii="Georgia" w:cs="Georgia" w:eastAsia="Georgia" w:hAnsi="Georgia"/>
+          <w:sz w:val="21"/>
+          <w:szCs w:val="21"/>
+        </w:rPr>
+        <w:t xml:space="preserve"> The per-package download counts behind the Gini of 0.9611, the 63.6% top-1 share and the 1.9% weighted rate were not in the release, while Section 10 claimed everything was. </w:t>
+      </w:r>
+      <w:r>
+        <w:rPr>
+          <w:rFonts w:ascii="Consolas" w:cs="Consolas" w:eastAsia="Consolas" w:hAnsi="Consolas"/>
+          <w:sz w:val="19"/>
+          <w:szCs w:val="19"/>
+        </w:rPr>
+        <w:t xml:space="preserve">pypi_weighted_result.json</w:t>
+      </w:r>
+      <w:r>
+        <w:rPr>
+          <w:rFonts w:ascii="Georgia" w:cs="Georgia" w:eastAsia="Georgia" w:hAnsi="Georgia"/>
+          <w:sz w:val="21"/>
+          <w:szCs w:val="21"/>
+        </w:rPr>
+        <w:t xml:space="preserve"> has been added. So has </w:t>
+      </w:r>
+      <w:r>
+        <w:rPr>
+          <w:rFonts w:ascii="Consolas" w:cs="Consolas" w:eastAsia="Consolas" w:hAnsi="Consolas"/>
+          <w:sz w:val="19"/>
+          <w:szCs w:val="19"/>
+        </w:rPr>
+        <w:t xml:space="preserve">walk250.jsonl</w:t>
+      </w:r>
+      <w:r>
+        <w:rPr>
+          <w:rFonts w:ascii="Georgia" w:cs="Georgia" w:eastAsia="Georgia" w:hAnsi="Georgia"/>
+          <w:sz w:val="21"/>
+          <w:szCs w:val="21"/>
+        </w:rPr>
+        <w:t xml:space="preserve">, without which row 3 could not be recomputed.</w:t>
+      </w:r>
+    </w:p>
+    <w:p>
+      <w:pPr>
+        <w:spacing w:after="160"/>
+        <w:jc w:val="left"/>
+      </w:pPr>
+      <w:r>
+        <w:rPr>
+          <w:rFonts w:ascii="Georgia" w:cs="Georgia" w:eastAsia="Georgia" w:hAnsi="Georgia"/>
+          <w:b/>
+          <w:bCs/>
+          <w:sz w:val="21"/>
+          <w:szCs w:val="21"/>
+        </w:rPr>
+        <w:t xml:space="preserve">Row 7 was called a null and is not one.</w:t>
+      </w:r>
+      <w:r>
+        <w:rPr>
+          <w:rFonts w:ascii="Georgia" w:cs="Georgia" w:eastAsia="Georgia" w:hAnsi="Georgia"/>
+          <w:sz w:val="21"/>
+          <w:szCs w:val="21"/>
+        </w:rPr>
+        <w:t xml:space="preserve"> It is two significant results in opposite directions. Version 1.0.1 as first drafted repeated 1.0.0's framing; this was caught by a second verification pass and the row is now reported as a bound. The title gained the qualifier "on the dimensions a registry exposes" in the same pass, because "no elevated risk" unqualified asserts more than the table supports.</w:t>
+      </w:r>
+    </w:p>
+    <w:p>
+      <w:pPr>
+        <w:spacing w:after="160"/>
+        <w:jc w:val="left"/>
+      </w:pPr>
+      <w:r>
+        <w:rPr>
+          <w:rFonts w:ascii="Georgia" w:cs="Georgia" w:eastAsia="Georgia" w:hAnsi="Georgia"/>
+          <w:b/>
+          <w:bCs/>
+          <w:sz w:val="21"/>
+          <w:szCs w:val="21"/>
+        </w:rPr>
+        <w:t xml:space="preserve">Prose downstream of the corrected rows was not corrected in the first pass.</w:t>
+      </w:r>
+      <w:r>
+        <w:rPr>
+          <w:rFonts w:ascii="Georgia" w:cs="Georgia" w:eastAsia="Georgia" w:hAnsi="Georgia"/>
+          <w:sz w:val="21"/>
+          <w:szCs w:val="21"/>
+        </w:rPr>
+        <w:t xml:space="preserve"> Section 4.1 still quoted a one-in-four rate for npm packages declaring a license they do not ship, which was the withdrawn control's 24.8%. The release README still carried the odds-ratio-as-risk-ratio phrasing and the 8,229 figure that this changelog says were fixed. Both are now corrected. This is the third time in one paper that a correction was applied in one place and not the others.</w:t>
+      </w:r>
+    </w:p>
+    <w:p>
+      <w:pPr>
+        <w:spacing w:after="160"/>
+        <w:jc w:val="left"/>
+      </w:pPr>
+      <w:r>
+        <w:rPr>
+          <w:rFonts w:ascii="Georgia" w:cs="Georgia" w:eastAsia="Georgia" w:hAnsi="Georgia"/>
+          <w:b/>
+          <w:bCs/>
+          <w:sz w:val="21"/>
+          <w:szCs w:val="21"/>
+        </w:rPr>
+        <w:t xml:space="preserve">Four smaller corrections.</w:t>
+      </w:r>
+      <w:r>
+        <w:rPr>
+          <w:rFonts w:ascii="Georgia" w:cs="Georgia" w:eastAsia="Georgia" w:hAnsi="Georgia"/>
+          <w:sz w:val="21"/>
+          <w:szCs w:val="21"/>
+        </w:rPr>
+        <w:t xml:space="preserve"> The npm frame population is 8,227, not 8,229, stated twice. Maximum dependency-tree depth is 11, not 10; the figure of 10 came from the superseded round-one dataset. The functional-cluster count is 12 of 15 with a clean option in all five most prominent members, not 13, and the remainder is three clusters at four, three and four of five, not two at three of five. The summary described an odds ratio of 2.45 as "2.4 times more likely", which is a risk-ratio phrasing; the risk ratio is 1.8.</w:t>
+      </w:r>
+    </w:p>
+    <w:p>
+      <w:pPr>
+        <w:spacing w:after="160"/>
+        <w:jc w:val="left"/>
+      </w:pPr>
+      <w:r>
+        <w:rPr>
+          <w:rFonts w:ascii="Georgia" w:cs="Georgia" w:eastAsia="Georgia" w:hAnsi="Georgia"/>
+          <w:sz w:val="21"/>
+          <w:szCs w:val="21"/>
+        </w:rPr>
+        <w:t xml:space="preserve">None of these changes affect Section 3, Section 5, Section 7, or the structural facts in Section 1. The PyPI licensing result, the usage-concentration result, and the install-hook figures all reproduce from raw records unchanged.</w:t>
       </w:r>
     </w:p>
     <w:sectPr>

</xml_diff>